<commit_message>
Revise CAT 1 answers into a more natural essay voice
Co-Authored-By: Claude Opus 5.5 <noreply@anthropic.com>
Claude-Session: https://claude.ai/code/session_01BLEmu8fp6gc6eg5Y96hy2x
</commit_message>
<xml_diff>
--- a/CAT1_Religion_Culture_Conflict.docx
+++ b/CAT1_Religion_Culture_Conflict.docx
@@ -54,7 +54,7 @@
         <w:rPr>
           <w:rFonts w:ascii="Times New Roman" w:cs="Times New Roman" w:eastAsia="Times New Roman" w:hAnsi="Times New Roman"/>
         </w:rPr>
-        <w:t xml:space="preserve">Samuel Huntington first set out his thesis in a 1993 article in </w:t>
+        <w:t xml:space="preserve">Few ideas in international relations have travelled as far as Samuel Huntington's. He first floated the "clash of civilizations" in a 1993 article in </w:t>
       </w:r>
       <w:r>
         <w:rPr>
@@ -68,40 +68,40 @@
         <w:rPr>
           <w:rFonts w:ascii="Times New Roman" w:cs="Times New Roman" w:eastAsia="Times New Roman" w:hAnsi="Times New Roman"/>
         </w:rPr>
-        <w:t xml:space="preserve"> and developed it three years later into a book (Huntington, 1993, 1996). Writing just after the Cold War, he rejected the optimism of those who expected liberal democracy to spread smoothly across the globe. In his view, the great divisions of humankind and the dominating source of conflict would no longer be ideological or primarily economic, but cultural. People would increasingly define themselves by ancestry, religion, language, history and values, and they would group into a small number of "civilizations": Western, Islamic, Sinic (Confucian), Hindu, Orthodox, Japanese, Latin American and, possibly, African. The most dangerous conflicts, he predicted, would occur along the "fault lines" between these civilizations, and especially between the West and an alliance of Islamic and Sinic states (Huntington, 1996).</w:t>
-      </w:r>
-    </w:p>
-    <w:p>
-      <w:pPr>
-        <w:jc w:val="both"/>
-      </w:pPr>
-      <w:r>
-        <w:rPr>
-          <w:rFonts w:ascii="Times New Roman" w:cs="Times New Roman" w:eastAsia="Times New Roman" w:hAnsi="Times New Roman"/>
-        </w:rPr>
-        <w:t xml:space="preserve">Three decades later, the thesis remains one of the most cited and most contested ideas in international relations. It is worth evaluating against what has actually happened in the twenty-first century.</w:t>
-      </w:r>
-    </w:p>
-    <w:p>
-      <w:pPr>
-        <w:pStyle w:val="Heading3"/>
-      </w:pPr>
-      <w:r>
-        <w:rPr>
-          <w:rFonts w:ascii="Times New Roman" w:cs="Times New Roman" w:eastAsia="Times New Roman" w:hAnsi="Times New Roman"/>
-        </w:rPr>
-        <w:t xml:space="preserve">Where the thesis appears to hold</w:t>
-      </w:r>
-    </w:p>
-    <w:p>
-      <w:pPr>
-        <w:jc w:val="both"/>
-      </w:pPr>
-      <w:r>
-        <w:rPr>
-          <w:rFonts w:ascii="Times New Roman" w:cs="Times New Roman" w:eastAsia="Times New Roman" w:hAnsi="Times New Roman"/>
-        </w:rPr>
-        <w:t xml:space="preserve">There are reasons why the thesis has refused to go away. The attacks of 11 September 2001, the wars in Afghanistan and Iraq, and the rise of transnational jihadist movements such as al-Qaeda and the Islamic State seemed, to many observers, to confirm the picture of a confrontation between the West and Islam. Groups such as al-Qaeda themselves used civilizational language, presenting their struggle as a defence of the Muslim </w:t>
+        <w:t xml:space="preserve">, ending the title with a question mark, and three years later expanded it into a book in which the question mark had disappeared (Huntington, 1993, 1996). The Cold War had just ended and many commentators expected liberal democracy and free markets to spread without much resistance. Huntington was not convinced. He argued that the main divisions in the world would now be cultural rather than ideological or economic. People would identify themselves by religion, language, history and custom, and these identities would cluster into a handful of civilizations: Western, Islamic, Sinic, Hindu, Orthodox, Japanese, Latin American and perhaps African. The most dangerous conflicts would break out along the "fault lines" where these civilizations meet, with the West facing its sharpest challenge from the Islamic and Sinic worlds (Huntington, 1996).</w:t>
+      </w:r>
+    </w:p>
+    <w:p>
+      <w:pPr>
+        <w:jc w:val="both"/>
+      </w:pPr>
+      <w:r>
+        <w:rPr>
+          <w:rFonts w:ascii="Times New Roman" w:cs="Times New Roman" w:eastAsia="Times New Roman" w:hAnsi="Times New Roman"/>
+        </w:rPr>
+        <w:t xml:space="preserve">Thirty years on, how well does the argument hold up? My view is that Huntington spotted something real but explained it badly.</w:t>
+      </w:r>
+    </w:p>
+    <w:p>
+      <w:pPr>
+        <w:pStyle w:val="Heading3"/>
+      </w:pPr>
+      <w:r>
+        <w:rPr>
+          <w:rFonts w:ascii="Times New Roman" w:cs="Times New Roman" w:eastAsia="Times New Roman" w:hAnsi="Times New Roman"/>
+        </w:rPr>
+        <w:t xml:space="preserve">What Huntington got right</w:t>
+      </w:r>
+    </w:p>
+    <w:p>
+      <w:pPr>
+        <w:jc w:val="both"/>
+      </w:pPr>
+      <w:r>
+        <w:rPr>
+          <w:rFonts w:ascii="Times New Roman" w:cs="Times New Roman" w:eastAsia="Times New Roman" w:hAnsi="Times New Roman"/>
+        </w:rPr>
+        <w:t xml:space="preserve">It is easy to see why the thesis became so popular after 2001. The September 11 attacks, the wars in Afghanistan and Iraq and the spread of groups like al-Qaeda and the Islamic State looked, to many people, like the clash he had predicted. The jihadists themselves certainly talked that way. Their statements are full of references to "Crusaders and Jews" and to the defence of the Muslim </w:t>
       </w:r>
       <w:r>
         <w:rPr>
@@ -115,112 +115,84 @@
         <w:rPr>
           <w:rFonts w:ascii="Times New Roman" w:cs="Times New Roman" w:eastAsia="Times New Roman" w:hAnsi="Times New Roman"/>
         </w:rPr>
-        <w:t xml:space="preserve"> against "Crusaders and Jews". Huntington also anticipated the return of identity politics in the West: debates over immigration, Islam and national culture in Europe and North America, and the rise of nationalist parties, echo his warning that culture would become central to politics. Russia's appeal to a "Russian world" defined partly by Orthodox Christianity, and the Chinese state's emphasis on a distinct civilizational path, have also been read as evidence that leaders find civilizational framing useful (Huntington, 1996).</w:t>
-      </w:r>
-    </w:p>
-    <w:p>
-      <w:pPr>
-        <w:jc w:val="both"/>
-      </w:pPr>
-      <w:r>
-        <w:rPr>
-          <w:rFonts w:ascii="Times New Roman" w:cs="Times New Roman" w:eastAsia="Times New Roman" w:hAnsi="Times New Roman"/>
-        </w:rPr>
-        <w:t xml:space="preserve">Huntington was also right in one broad sense. Religion and culture did not fade from politics as modernisation theorists had expected. Identity has remained a powerful resource for mobilisation, and religiously framed violence has been a significant feature of the period, from northern Nigeria and the Sahel to Somalia, Iraq and Syria.</w:t>
-      </w:r>
-    </w:p>
-    <w:p>
-      <w:pPr>
-        <w:pStyle w:val="Heading3"/>
-      </w:pPr>
-      <w:r>
-        <w:rPr>
-          <w:rFonts w:ascii="Times New Roman" w:cs="Times New Roman" w:eastAsia="Times New Roman" w:hAnsi="Times New Roman"/>
-        </w:rPr>
-        <w:t xml:space="preserve">Where the thesis falls short</w:t>
-      </w:r>
-    </w:p>
-    <w:p>
-      <w:pPr>
-        <w:jc w:val="both"/>
-      </w:pPr>
-      <w:r>
-        <w:rPr>
-          <w:rFonts w:ascii="Times New Roman" w:cs="Times New Roman" w:eastAsia="Times New Roman" w:hAnsi="Times New Roman"/>
-        </w:rPr>
-        <w:t xml:space="preserve">The weaknesses, however, are serious. The first is empirical. Most violent conflicts since 1990 have taken place </w:t>
-      </w:r>
-      <w:r>
-        <w:rPr>
-          <w:rFonts w:ascii="Times New Roman" w:cs="Times New Roman" w:eastAsia="Times New Roman" w:hAnsi="Times New Roman"/>
-          <w:i/>
-          <w:iCs/>
-        </w:rPr>
-        <w:t xml:space="preserve">within</w:t>
-      </w:r>
-      <w:r>
-        <w:rPr>
-          <w:rFonts w:ascii="Times New Roman" w:cs="Times New Roman" w:eastAsia="Times New Roman" w:hAnsi="Times New Roman"/>
-        </w:rPr>
-        <w:t xml:space="preserve"> Huntington's civilizations rather than between them. Quantitative studies found little evidence that states from different civilizations were more likely to fight each other than states from the same civilization once realist and liberal factors such as power, contiguity, alliances and democracy were taken into account (Henderson &amp; Tucker, 2001; Russett et al., 2000). Fox (2004), studying ethnic and civil conflicts from 1945 into the new millennium, likewise found that civilizational conflicts did not become proportionally more common after the Cold War.</w:t>
-      </w:r>
-    </w:p>
-    <w:p>
-      <w:pPr>
-        <w:jc w:val="both"/>
-      </w:pPr>
-      <w:r>
-        <w:rPr>
-          <w:rFonts w:ascii="Times New Roman" w:cs="Times New Roman" w:eastAsia="Times New Roman" w:hAnsi="Times New Roman"/>
-        </w:rPr>
-        <w:t xml:space="preserve">Twenty-first-century wars underline the point. The deadliest violence in the Middle East has been among Muslims: the Syrian civil war, the war in Yemen, and the campaigns of the Islamic State, whose victims were overwhelmingly Muslim. Russia's invasion of Ukraine in 2022 is a war between two largely Orthodox Christian nations, which in Huntington's scheme belong to the same civilization. In Africa, the war in Ethiopia's Tigray region (2020–2022) pitted largely Orthodox Christian communities against each other, while the war that broke out in Sudan in April 2023 is a struggle between two Muslim-led armed forces, the Sudanese Armed Forces and the Rapid Support Forces. The rivalry between Saudi Arabia and Iran, which drives many conflicts in the region, also runs </w:t>
-      </w:r>
-      <w:r>
-        <w:rPr>
-          <w:rFonts w:ascii="Times New Roman" w:cs="Times New Roman" w:eastAsia="Times New Roman" w:hAnsi="Times New Roman"/>
-          <w:i/>
-          <w:iCs/>
-        </w:rPr>
-        <w:t xml:space="preserve">through</w:t>
-      </w:r>
-      <w:r>
-        <w:rPr>
-          <w:rFonts w:ascii="Times New Roman" w:cs="Times New Roman" w:eastAsia="Times New Roman" w:hAnsi="Times New Roman"/>
-        </w:rPr>
-        <w:t xml:space="preserve"> the Islamic world. None of these cases fits a model of civilizations clashing at their borders.</w:t>
-      </w:r>
-    </w:p>
-    <w:p>
-      <w:pPr>
-        <w:jc w:val="both"/>
-      </w:pPr>
-      <w:r>
-        <w:rPr>
-          <w:rFonts w:ascii="Times New Roman" w:cs="Times New Roman" w:eastAsia="Times New Roman" w:hAnsi="Times New Roman"/>
-        </w:rPr>
-        <w:t xml:space="preserve">The second weakness is conceptual. Huntington treats civilizations as coherent, bounded blocs with shared values and interests. In reality, each so-called civilization is internally divided by sect, ethnicity, class, ideology and national interest. Edward Said (2001) called this a "clash of ignorance", arguing that Huntington turned vast, dynamic and contested traditions into fixed "shut-down, sealed-off entities". Amartya Sen (2006) makes a related argument: every person holds many identities at once, as a citizen, a worker, a member of a profession, a believer, a speaker of a language, and reducing people to a single civilizational identity is not only inaccurate but dangerous, because it narrows the space for the overlapping loyalties that make peace possible. The classification itself is also uneven. Huntington was unsure whether Africa even constituted a civilization, and his scheme struggles with places like Ethiopia, Nigeria or Kenya, where Christian, Muslim and indigenous traditions coexist within the same nation and often within the same families.</w:t>
-      </w:r>
-    </w:p>
-    <w:p>
-      <w:pPr>
-        <w:jc w:val="both"/>
-      </w:pPr>
-      <w:r>
-        <w:rPr>
-          <w:rFonts w:ascii="Times New Roman" w:cs="Times New Roman" w:eastAsia="Times New Roman" w:hAnsi="Times New Roman"/>
-        </w:rPr>
-        <w:t xml:space="preserve">Third, the thesis is weak on causation. It tells us that conflicts are framed in cultural terms but not why they start or escalate. Research on civil war suggests that state weakness, poverty, rough terrain, access to lootable resources and political exclusion are stronger predictors of conflict onset than ethnic or religious diversity as such (Collier &amp; Hoeffler, 2004; Fearon &amp; Laitin, 2003). Al-Shabaab's insurgency in Somalia and its attacks in Kenya, for example, cannot be understood without reference to the collapse of the Somali state, clan politics, foreign intervention and the economic marginalisation of Kenya's north-eastern and coastal regions.</w:t>
-      </w:r>
-    </w:p>
-    <w:p>
-      <w:pPr>
-        <w:jc w:val="both"/>
-      </w:pPr>
-      <w:r>
-        <w:rPr>
-          <w:rFonts w:ascii="Times New Roman" w:cs="Times New Roman" w:eastAsia="Times New Roman" w:hAnsi="Times New Roman"/>
-        </w:rPr>
-        <w:t xml:space="preserve">Finally, critics warn that the thesis risks becoming self-fulfilling. If policy makers and publics come to believe that the West and Islam are destined to clash, they may adopt policies, such as discriminatory security measures or interventions justified in civilizational terms, that alienate ordinary Muslims and hand extremists a ready-made narrative (Mamdani, 2004). Extremist groups and Western populists alike have found Huntington's language useful precisely because it simplifies complex grievances into a story of "us" versus "them".</w:t>
+        <w:t xml:space="preserve">. Huntington also saw early that identity would return to the centre of Western politics, and the arguments over immigration, Islam and national culture in Europe and the United States suggest he had a point. Leaders elsewhere have borrowed his language too. Moscow talks of a "Russian world" bound together partly by Orthodox Christianity, and Beijing increasingly presents China as a civilization with its own path.</w:t>
+      </w:r>
+    </w:p>
+    <w:p>
+      <w:pPr>
+        <w:jc w:val="both"/>
+      </w:pPr>
+      <w:r>
+        <w:rPr>
+          <w:rFonts w:ascii="Times New Roman" w:cs="Times New Roman" w:eastAsia="Times New Roman" w:hAnsi="Times New Roman"/>
+        </w:rPr>
+        <w:t xml:space="preserve">More broadly, Huntington was right that religion would not quietly fade away as societies modernised, which is what many social scientists had assumed. From the Sahel to Somalia and from Iraq to Myanmar, religion has remained a powerful way of rallying people, including for violence.</w:t>
+      </w:r>
+    </w:p>
+    <w:p>
+      <w:pPr>
+        <w:pStyle w:val="Heading3"/>
+      </w:pPr>
+      <w:r>
+        <w:rPr>
+          <w:rFonts w:ascii="Times New Roman" w:cs="Times New Roman" w:eastAsia="Times New Roman" w:hAnsi="Times New Roman"/>
+        </w:rPr>
+        <w:t xml:space="preserve">Where the argument breaks down</w:t>
+      </w:r>
+    </w:p>
+    <w:p>
+      <w:pPr>
+        <w:jc w:val="both"/>
+      </w:pPr>
+      <w:r>
+        <w:rPr>
+          <w:rFonts w:ascii="Times New Roman" w:cs="Times New Roman" w:eastAsia="Times New Roman" w:hAnsi="Times New Roman"/>
+        </w:rPr>
+        <w:t xml:space="preserve">The trouble starts when we look at who has actually been fighting whom. Most wars since 1990 have taken place inside Huntington's civilizations, not across their borders. When researchers tested the thesis statistically, they found that states from different civilizations were no more likely to fight one another once ordinary factors such as power, shared borders, alliances and democracy were taken into account (Henderson &amp; Tucker, 2001; Russett et al., 2000). Fox (2004) reached a similar conclusion for ethnic and civil conflicts: civilizational clashes did not become noticeably more common after the Cold War.</w:t>
+      </w:r>
+    </w:p>
+    <w:p>
+      <w:pPr>
+        <w:jc w:val="both"/>
+      </w:pPr>
+      <w:r>
+        <w:rPr>
+          <w:rFonts w:ascii="Times New Roman" w:cs="Times New Roman" w:eastAsia="Times New Roman" w:hAnsi="Times New Roman"/>
+        </w:rPr>
+        <w:t xml:space="preserve">Recent wars make the point even more starkly. The bloodiest fighting in the Middle East has been among Muslims, in Syria, in Yemen and in the territories once held by the Islamic State, whose victims were mostly Muslims themselves. Russia's invasion of Ukraine in 2022 is a war between two mainly Orthodox Christian countries, which Huntington would place in the same civilization. Closer to home, the war in Tigray between 2020 and 2022 was fought largely among Orthodox Christians, and the war in Sudan that began in April 2023 pits two Muslim-led forces, the army and the Rapid Support Forces, against each other. Even the Saudi–Iranian rivalry that fuels so much of the region's violence runs straight through the Islamic world. None of this looks like civilizations colliding at their edges.</w:t>
+      </w:r>
+    </w:p>
+    <w:p>
+      <w:pPr>
+        <w:jc w:val="both"/>
+      </w:pPr>
+      <w:r>
+        <w:rPr>
+          <w:rFonts w:ascii="Times New Roman" w:cs="Times New Roman" w:eastAsia="Times New Roman" w:hAnsi="Times New Roman"/>
+        </w:rPr>
+        <w:t xml:space="preserve">The concept of a civilization is also shakier than Huntington admits. He writes as if each civilization were a single bloc with shared values and interests. In reality every one of them is split by sect, ethnicity, class, ideology and national rivalry. Edward Said (2001) mocked the thesis as a "clash of ignorance", accusing Huntington of turning living, argued-over traditions into "shut-down, sealed-off entities". Amartya Sen (2006) makes a related and, I think, more important point. Each of us holds many identities at once: citizen, worker, parent, believer, speaker of a particular language. Squeezing people into one civilizational box is not just inaccurate. It is dangerous, because it erases the overlapping loyalties that keep communities together. Huntington himself was unsure whether Africa counted as a civilization at all, and his scheme has little to say about countries like Kenya, Nigeria or Ethiopia, where Christians, Muslims and followers of indigenous religions live side by side, and often in the same families.</w:t>
+      </w:r>
+    </w:p>
+    <w:p>
+      <w:pPr>
+        <w:jc w:val="both"/>
+      </w:pPr>
+      <w:r>
+        <w:rPr>
+          <w:rFonts w:ascii="Times New Roman" w:cs="Times New Roman" w:eastAsia="Times New Roman" w:hAnsi="Times New Roman"/>
+        </w:rPr>
+        <w:t xml:space="preserve">A further problem is that the thesis tells us how conflicts are described, not why they happen. Studies of civil war point instead to weak states, poverty, rough terrain, lootable resources and the political exclusion of particular groups (Collier &amp; Hoeffler, 2004; Fearon &amp; Laitin, 2003). Al-Shabaab is a good example. Its insurgency in Somalia and its attacks in Kenya make little sense without the collapse of the Somali state, clan politics, foreign military intervention and the long neglect of Kenya's north-eastern and coastal regions.</w:t>
+      </w:r>
+    </w:p>
+    <w:p>
+      <w:pPr>
+        <w:jc w:val="both"/>
+      </w:pPr>
+      <w:r>
+        <w:rPr>
+          <w:rFonts w:ascii="Times New Roman" w:cs="Times New Roman" w:eastAsia="Times New Roman" w:hAnsi="Times New Roman"/>
+        </w:rPr>
+        <w:t xml:space="preserve">Lastly, there is the danger that the thesis fulfils its own prophecy. If governments and voters come to believe that the West and Islam are bound to clash, they may support policies that alienate ordinary Muslims and give extremists exactly the story they want to tell (Mamdani, 2004). It is telling that both jihadist recruiters and Western populists have found Huntington's language so useful.</w:t>
       </w:r>
     </w:p>
     <w:p>
@@ -242,21 +214,7 @@
         <w:rPr>
           <w:rFonts w:ascii="Times New Roman" w:cs="Times New Roman" w:eastAsia="Times New Roman" w:hAnsi="Times New Roman"/>
         </w:rPr>
-        <w:t xml:space="preserve">Huntington deserves credit for recognising, earlier than many, that culture and religion would remain central to world politics after the Cold War. As a predictive and explanatory theory of twenty-first-century conflict, however, the clash of civilizations is unconvincing. Most wars have been fought within, not between, civilizations; civilizations are too internally divided to act as unified blocs; and the root causes of violence usually lie in politics, economics and state capacity. The thesis is best understood not as an accurate map of conflict, but as a description of a powerful </w:t>
-      </w:r>
-      <w:r>
-        <w:rPr>
-          <w:rFonts w:ascii="Times New Roman" w:cs="Times New Roman" w:eastAsia="Times New Roman" w:hAnsi="Times New Roman"/>
-          <w:i/>
-          <w:iCs/>
-        </w:rPr>
-        <w:t xml:space="preserve">framing</w:t>
-      </w:r>
-      <w:r>
-        <w:rPr>
-          <w:rFonts w:ascii="Times New Roman" w:cs="Times New Roman" w:eastAsia="Times New Roman" w:hAnsi="Times New Roman"/>
-        </w:rPr>
-        <w:t xml:space="preserve"> that political actors sometimes use to mobilise support, and whose spread can make conflict more likely.</w:t>
+        <w:t xml:space="preserve">Huntington deserves credit for seeing that culture and religion would matter a great deal after the Cold War. As an explanation of twenty-first-century conflict, though, the clash of civilizations does not stand up. Most wars have been fought within civilizations, civilizations are too divided to act as blocs, and the roots of violence usually lie in politics, economics and the weakness of states. The thesis is more useful as a description of a powerful story that leaders tell to win support, and a reminder that such stories can make conflict more likely, than as a map of where wars will actually occur.</w:t>
       </w:r>
     </w:p>
     <w:p>
@@ -289,84 +247,84 @@
         <w:rPr>
           <w:rFonts w:ascii="Times New Roman" w:cs="Times New Roman" w:eastAsia="Times New Roman" w:hAnsi="Times New Roman"/>
         </w:rPr>
-        <w:t xml:space="preserve">One of the oldest debates in the study of religion and conflict is whether religion is a genuine cause of violence or a cover for other interests. On one side are those who argue that religious beliefs, by dealing in absolutes, sacred space and cosmic struggle, can drive conflict in their own right (Juergensmeyer, 2003). On the other are those who see religion mainly as a marker or mobilising tool that elites use to pursue power, land, oil or jobs (Brass, 1997). The most persuasive position lies between these poles: religion is rarely the sole cause of conflict, but it is more than a mere proxy, because once a conflict has been framed in religious terms, religion changes how the conflict is fought and how hard it is to end.</w:t>
-      </w:r>
-    </w:p>
-    <w:p>
-      <w:pPr>
-        <w:pStyle w:val="Heading3"/>
-      </w:pPr>
-      <w:r>
-        <w:rPr>
-          <w:rFonts w:ascii="Times New Roman" w:cs="Times New Roman" w:eastAsia="Times New Roman" w:hAnsi="Times New Roman"/>
-        </w:rPr>
-        <w:t xml:space="preserve">Religion as a proxy for other grievances</w:t>
-      </w:r>
-    </w:p>
-    <w:p>
-      <w:pPr>
-        <w:jc w:val="both"/>
-      </w:pPr>
-      <w:r>
-        <w:rPr>
-          <w:rFonts w:ascii="Times New Roman" w:cs="Times New Roman" w:eastAsia="Times New Roman" w:hAnsi="Times New Roman"/>
-        </w:rPr>
-        <w:t xml:space="preserve">A large body of evidence supports the proxy view. Cross-national studies of civil war onset find that religious or ethnic diversity in itself does not predict conflict well; poverty, weak states, political exclusion and access to resources matter more (Collier &amp; Hoeffler, 2004; Fearon &amp; Laitin, 2003). Many conflicts commonly described as religious turn out, on closer examination, to be rooted in material and political disputes.</w:t>
-      </w:r>
-    </w:p>
-    <w:p>
-      <w:pPr>
-        <w:jc w:val="both"/>
-      </w:pPr>
-      <w:r>
-        <w:rPr>
-          <w:rFonts w:ascii="Times New Roman" w:cs="Times New Roman" w:eastAsia="Times New Roman" w:hAnsi="Times New Roman"/>
-        </w:rPr>
-        <w:t xml:space="preserve">Nigeria offers clear examples. Clashes between largely Muslim Fulani herders and largely Christian farming communities in the Middle Belt are often reported as religious violence. Yet the underlying drivers include competition over land and water, the southward movement of herders as a result of desertification, population growth, the breakdown of traditional grazing arrangements and the failure of the state to provide security and justice. Religion overlaps with occupation and ethnicity, and it gives the conflict its vocabulary, but it is not what the parties are mainly fighting over. Similarly, the rise of Boko Haram cannot be separated from deep poverty, youth unemployment, poor governance and police brutality in north-eastern Nigeria, even though the group frames its goals in religious terms.</w:t>
-      </w:r>
-    </w:p>
-    <w:p>
-      <w:pPr>
-        <w:jc w:val="both"/>
-      </w:pPr>
-      <w:r>
-        <w:rPr>
-          <w:rFonts w:ascii="Times New Roman" w:cs="Times New Roman" w:eastAsia="Times New Roman" w:hAnsi="Times New Roman"/>
-        </w:rPr>
-        <w:t xml:space="preserve">The Middle East shows how religious divisions can be "sectarianised" by political actors. Hashemi and Postel (2017) argue that the Sunni–Shia divide is not an ancient hatred that inevitably produces violence; rather, authoritarian regimes and regional powers, notably Saudi Arabia and Iran, have deliberately mobilised sectarian identities to shore up their rule and expand their influence, particularly after the 2003 invasion of Iraq and the 2011 uprisings. In the Central African Republic, the violence between the mainly Muslim Seleka coalition and the mainly Christian anti-balaka militias from 2013 grew out of a struggle for state power and control of resources, and only later took on a strongly religious character. In Kenya, too, analyses of radicalisation at the coast and in the north-east point to economic marginalisation, land injustice and heavy-handed security operations as key drivers, alongside religious ideology.</w:t>
-      </w:r>
-    </w:p>
-    <w:p>
-      <w:pPr>
-        <w:pStyle w:val="Heading3"/>
-      </w:pPr>
-      <w:r>
-        <w:rPr>
-          <w:rFonts w:ascii="Times New Roman" w:cs="Times New Roman" w:eastAsia="Times New Roman" w:hAnsi="Times New Roman"/>
-        </w:rPr>
-        <w:t xml:space="preserve">Religion as a primary fault line</w:t>
-      </w:r>
-    </w:p>
-    <w:p>
-      <w:pPr>
-        <w:jc w:val="both"/>
-      </w:pPr>
-      <w:r>
-        <w:rPr>
-          <w:rFonts w:ascii="Times New Roman" w:cs="Times New Roman" w:eastAsia="Times New Roman" w:hAnsi="Times New Roman"/>
-        </w:rPr>
-        <w:t xml:space="preserve">Yet treating religion purely as a proxy misses something important. Hasenclever and Rittberger (2000) suggest that even where the roots of conflict are political or economic, religion can independently shape whether and how conflicts become violent. Several features of religion help explain this.</w:t>
-      </w:r>
-    </w:p>
-    <w:p>
-      <w:pPr>
-        <w:jc w:val="both"/>
-      </w:pPr>
-      <w:r>
-        <w:rPr>
-          <w:rFonts w:ascii="Times New Roman" w:cs="Times New Roman" w:eastAsia="Times New Roman" w:hAnsi="Times New Roman"/>
-        </w:rPr>
-        <w:t xml:space="preserve">First, religion can turn negotiable interests into non-negotiable values. When territory becomes </w:t>
+        <w:t xml:space="preserve">Is religion really what people are fighting about, or is it a cover for something else? Scholars have argued over this for a long time. Some, like Juergensmeyer (2003), take religious motives seriously and show how ideas of sacred duty and cosmic struggle can drive violence on their own. Others, such as Brass (1997), see religion mostly as a label or a rallying cry that elites use while they fight over power, land, oil or jobs. I will argue that the truth lies somewhere in between. Religion is seldom the root cause of a conflict, but it is more than a disguise, because once a conflict takes on a religious character, the way it is fought and the chances of ending it both change.</w:t>
+      </w:r>
+    </w:p>
+    <w:p>
+      <w:pPr>
+        <w:pStyle w:val="Heading3"/>
+      </w:pPr>
+      <w:r>
+        <w:rPr>
+          <w:rFonts w:ascii="Times New Roman" w:cs="Times New Roman" w:eastAsia="Times New Roman" w:hAnsi="Times New Roman"/>
+        </w:rPr>
+        <w:t xml:space="preserve">The case for religion as a proxy</w:t>
+      </w:r>
+    </w:p>
+    <w:p>
+      <w:pPr>
+        <w:jc w:val="both"/>
+      </w:pPr>
+      <w:r>
+        <w:rPr>
+          <w:rFonts w:ascii="Times New Roman" w:cs="Times New Roman" w:eastAsia="Times New Roman" w:hAnsi="Times New Roman"/>
+        </w:rPr>
+        <w:t xml:space="preserve">There is plenty of evidence for the proxy view. Large cross-country studies find that religious or ethnic diversity on its own does a poor job of predicting civil war. Poverty, weak states, exclusion from power and access to resources matter far more (Collier &amp; Hoeffler, 2004; Fearon &amp; Laitin, 2003). And many conflicts that the media describe as religious look quite different once you examine them closely.</w:t>
+      </w:r>
+    </w:p>
+    <w:p>
+      <w:pPr>
+        <w:jc w:val="both"/>
+      </w:pPr>
+      <w:r>
+        <w:rPr>
+          <w:rFonts w:ascii="Times New Roman" w:cs="Times New Roman" w:eastAsia="Times New Roman" w:hAnsi="Times New Roman"/>
+        </w:rPr>
+        <w:t xml:space="preserve">Nigeria is a good place to start. The clashes between mainly Muslim Fulani herders and mainly Christian farmers in the Middle Belt are usually reported as religious violence. Dig a little deeper and you find a struggle over land and water, made worse by desertification pushing herders south, rapid population growth, the collapse of old grazing agreements and a state that has largely failed to protect anyone. Religion happens to line up with occupation and ethnicity, and it supplies the language of the conflict, but it is not the prize. Boko Haram, too, speaks the language of faith, yet its growth is hard to separate from the poverty, joblessness, poor governance and police abuses that have long marked north-eastern Nigeria.</w:t>
+      </w:r>
+    </w:p>
+    <w:p>
+      <w:pPr>
+        <w:jc w:val="both"/>
+      </w:pPr>
+      <w:r>
+        <w:rPr>
+          <w:rFonts w:ascii="Times New Roman" w:cs="Times New Roman" w:eastAsia="Times New Roman" w:hAnsi="Times New Roman"/>
+        </w:rPr>
+        <w:t xml:space="preserve">The Middle East shows how political actors can turn religious difference into conflict on purpose. Hashemi and Postel (2017) use the term "sectarianization" for this process. The Sunni–Shia split, they argue, is not an ancient hatred waiting to explode. Authoritarian rulers and regional powers, especially Saudi Arabia and Iran, have stirred up sectarian feeling to protect their regimes and widen their influence, above all after the invasion of Iraq in 2003 and the uprisings of 2011. Something similar happened in the Central African Republic, where fighting between the largely Muslim Seleka and the largely Christian anti-balaka began as a fight over state power and resources and only later took on a strongly religious colour. Here in Kenya, most studies of radicalisation at the coast and in the north-east point to economic neglect, historical land injustices and harsh security crackdowns as much as to religious ideas.</w:t>
+      </w:r>
+    </w:p>
+    <w:p>
+      <w:pPr>
+        <w:pStyle w:val="Heading3"/>
+      </w:pPr>
+      <w:r>
+        <w:rPr>
+          <w:rFonts w:ascii="Times New Roman" w:cs="Times New Roman" w:eastAsia="Times New Roman" w:hAnsi="Times New Roman"/>
+        </w:rPr>
+        <w:t xml:space="preserve">The case for religion as a fault line in its own right</w:t>
+      </w:r>
+    </w:p>
+    <w:p>
+      <w:pPr>
+        <w:jc w:val="both"/>
+      </w:pPr>
+      <w:r>
+        <w:rPr>
+          <w:rFonts w:ascii="Times New Roman" w:cs="Times New Roman" w:eastAsia="Times New Roman" w:hAnsi="Times New Roman"/>
+        </w:rPr>
+        <w:t xml:space="preserve">Still, it would be a mistake to stop there. Hasenclever and Rittberger (2000) point out that even when a conflict starts over politics or money, religion can shape whether it turns violent and how violent it becomes. I see at least three reasons for this.</w:t>
+      </w:r>
+    </w:p>
+    <w:p>
+      <w:pPr>
+        <w:jc w:val="both"/>
+      </w:pPr>
+      <w:r>
+        <w:rPr>
+          <w:rFonts w:ascii="Times New Roman" w:cs="Times New Roman" w:eastAsia="Times New Roman" w:hAnsi="Times New Roman"/>
+        </w:rPr>
+        <w:t xml:space="preserve">The first is that religion can turn interests that could be bargained over into values that cannot. Land can be divided; </w:t>
       </w:r>
       <w:r>
         <w:rPr>
@@ -380,54 +338,40 @@
         <w:rPr>
           <w:rFonts w:ascii="Times New Roman" w:cs="Times New Roman" w:eastAsia="Times New Roman" w:hAnsi="Times New Roman"/>
         </w:rPr>
-        <w:t xml:space="preserve"> land, or a political cause becomes a divine duty, compromise is harder to accept. Disputes over sacred sites, such as Jerusalem or the Babri Masjid site in Ayodhya, India, are especially difficult to resolve. Svensson (2007) found that civil wars in which the parties make explicitly religious demands are less likely to end in negotiated settlements. Second, religion offers powerful resources for mobilisation: ready-made networks of mosques, churches and schools, respected leaders, and symbols that can convert anger into collective action. Third, religious ideas of martyrdom, cosmic war and reward in the afterlife can lower the perceived cost of fighting and justify extreme violence, including suicide attacks (Juergensmeyer, 2003). Toft (2007) shows that religious civil wars, especially where religion is central to the dispute, tend to be bloodier and to last longer than other civil wars.</w:t>
-      </w:r>
-    </w:p>
-    <w:p>
-      <w:pPr>
-        <w:jc w:val="both"/>
-      </w:pPr>
-      <w:r>
-        <w:rPr>
-          <w:rFonts w:ascii="Times New Roman" w:cs="Times New Roman" w:eastAsia="Times New Roman" w:hAnsi="Times New Roman"/>
-        </w:rPr>
-        <w:t xml:space="preserve">There are also movements whose goals are primarily religious. The Islamic State's project of a caliphate governed by its interpretation of sharia, or the Lord's Resistance Army's stated aim of ruling Uganda according to the Ten Commandments, cannot be reduced entirely to economic grievance, even if poverty and marginalisation supplied many of their recruits.</w:t>
-      </w:r>
-    </w:p>
-    <w:p>
-      <w:pPr>
-        <w:pStyle w:val="Heading3"/>
-      </w:pPr>
-      <w:r>
-        <w:rPr>
-          <w:rFonts w:ascii="Times New Roman" w:cs="Times New Roman" w:eastAsia="Times New Roman" w:hAnsi="Times New Roman"/>
-        </w:rPr>
-        <w:t xml:space="preserve">Assessment</w:t>
-      </w:r>
-    </w:p>
-    <w:p>
-      <w:pPr>
-        <w:jc w:val="both"/>
-      </w:pPr>
-      <w:r>
-        <w:rPr>
-          <w:rFonts w:ascii="Times New Roman" w:cs="Times New Roman" w:eastAsia="Times New Roman" w:hAnsi="Times New Roman"/>
-        </w:rPr>
-        <w:t xml:space="preserve">The evidence suggests that religion is rarely the </w:t>
-      </w:r>
-      <w:r>
-        <w:rPr>
-          <w:rFonts w:ascii="Times New Roman" w:cs="Times New Roman" w:eastAsia="Times New Roman" w:hAnsi="Times New Roman"/>
-          <w:i/>
-          <w:iCs/>
-        </w:rPr>
-        <w:t xml:space="preserve">primary</w:t>
-      </w:r>
-      <w:r>
-        <w:rPr>
-          <w:rFonts w:ascii="Times New Roman" w:cs="Times New Roman" w:eastAsia="Times New Roman" w:hAnsi="Times New Roman"/>
-        </w:rPr>
-        <w:t xml:space="preserve"> fault line at the start of a conflict. Political exclusion, competition for land and resources, state weakness and economic inequality usually come first. However, religion is more than a proxy. It shapes how grievances are understood, provides the networks and symbols through which people are mobilised, and can make conflicts more intense and harder to settle once it becomes central. Appleby (2000) captures this with the idea of the "ambivalence of the sacred": the same traditions that are used to justify violence also supply some of the most effective peacebuilders, as shown by inter-religious councils in Sierra Leone, Nigeria and Kenya. The relationship is therefore best described as interactive. Religion often begins as a marker that overlaps with other grievances, but through framing and escalation it can become a fault line in its own right.</w:t>
+        <w:t xml:space="preserve"> land is much harder to share. This is why disputes over sacred sites, such as Jerusalem or the Babri Masjid site in Ayodhya, have been so hard to settle, and why Svensson (2007) found that civil wars in which the parties make explicitly religious demands are less likely to end in negotiated agreements. The second is that religion offers ready-made tools for mobilisation: networks of mosques, churches and schools, respected leaders and symbols that can turn anger into action very quickly. The third is that beliefs about martyrdom, cosmic war and reward after death can make people willing to accept enormous costs, including death in a suicide attack (Juergensmeyer, 2003). It is no surprise, then, that Toft (2007) found religious civil wars, especially those where religion sits at the heart of the dispute, to be bloodier and longer than others.</w:t>
+      </w:r>
+    </w:p>
+    <w:p>
+      <w:pPr>
+        <w:jc w:val="both"/>
+      </w:pPr>
+      <w:r>
+        <w:rPr>
+          <w:rFonts w:ascii="Times New Roman" w:cs="Times New Roman" w:eastAsia="Times New Roman" w:hAnsi="Times New Roman"/>
+        </w:rPr>
+        <w:t xml:space="preserve">Some movements are also openly religious in their goals. The Islamic State wanted a caliphate run on its own reading of sharia, and the Lord's Resistance Army claimed it would govern Uganda by the Ten Commandments. Poverty and marginalisation certainly helped both groups find recruits, but their aims cannot be explained by economics alone.</w:t>
+      </w:r>
+    </w:p>
+    <w:p>
+      <w:pPr>
+        <w:pStyle w:val="Heading3"/>
+      </w:pPr>
+      <w:r>
+        <w:rPr>
+          <w:rFonts w:ascii="Times New Roman" w:cs="Times New Roman" w:eastAsia="Times New Roman" w:hAnsi="Times New Roman"/>
+        </w:rPr>
+        <w:t xml:space="preserve">My assessment</w:t>
+      </w:r>
+    </w:p>
+    <w:p>
+      <w:pPr>
+        <w:jc w:val="both"/>
+      </w:pPr>
+      <w:r>
+        <w:rPr>
+          <w:rFonts w:ascii="Times New Roman" w:cs="Times New Roman" w:eastAsia="Times New Roman" w:hAnsi="Times New Roman"/>
+        </w:rPr>
+        <w:t xml:space="preserve">On balance, religion is rarely the main fault line when a conflict begins. Exclusion from power, competition over land and resources, weak states and inequality usually come first. But religion is not just a proxy either. It shapes how people make sense of their grievances, provides the networks and symbols that bring them out onto the streets, and can make a conflict far harder to end once it becomes central. Appleby (2000) calls this the "ambivalence of the sacred". The same traditions that are used to justify killing also produce some of the most effective peacemakers, as the work of inter-religious councils in Sierra Leone, Nigeria and Kenya has shown. The best way to describe the relationship, I think, is as a two-way process. Religion often starts out as a marker that overlaps with other grievances, but through framing and escalation it can become a fault line of its own.</w:t>
       </w:r>
     </w:p>
     <w:p>
@@ -460,7 +404,7 @@
         <w:rPr>
           <w:rFonts w:ascii="Times New Roman" w:cs="Times New Roman" w:eastAsia="Times New Roman" w:hAnsi="Times New Roman"/>
         </w:rPr>
-        <w:t xml:space="preserve">Johan Galtung, one of the founders of peace research, argued that violence is much broader than physical harm. In his early work he distinguished </w:t>
+        <w:t xml:space="preserve">Johan Galtung spent much of his career arguing that violence is much more than bloodshed. In an early and very influential paper he separated </w:t>
       </w:r>
       <w:r>
         <w:rPr>
@@ -474,7 +418,7 @@
         <w:rPr>
           <w:rFonts w:ascii="Times New Roman" w:cs="Times New Roman" w:eastAsia="Times New Roman" w:hAnsi="Times New Roman"/>
         </w:rPr>
-        <w:t xml:space="preserve">, which is personal and visible (killing, maiming, torture, displacement), from </w:t>
+        <w:t xml:space="preserve">, the visible kind involving killing, injury, torture and forced displacement, from </w:t>
       </w:r>
       <w:r>
         <w:rPr>
@@ -488,7 +432,7 @@
         <w:rPr>
           <w:rFonts w:ascii="Times New Roman" w:cs="Times New Roman" w:eastAsia="Times New Roman" w:hAnsi="Times New Roman"/>
         </w:rPr>
-        <w:t xml:space="preserve">, which is built into social, economic and political systems and shows up as unequal life chances, poverty, exclusion and avoidable death (Galtung, 1969). Two decades later he added a third type, </w:t>
+        <w:t xml:space="preserve">, the kind built into social and economic systems that shows up as poverty, exclusion and lives cut short by causes that could have been prevented (Galtung, 1969). Twenty years later he added a third kind, </w:t>
       </w:r>
       <w:r>
         <w:rPr>
@@ -502,7 +446,7 @@
         <w:rPr>
           <w:rFonts w:ascii="Times New Roman" w:cs="Times New Roman" w:eastAsia="Times New Roman" w:hAnsi="Times New Roman"/>
         </w:rPr>
-        <w:t xml:space="preserve">, which he defined as "those aspects of culture, the symbolic sphere of our existence, exemplified by religion and ideology, language and art, empirical science and formal science, that can be used to justify or legitimize direct or structural violence" (Galtung, 1990, p. 291).</w:t>
+        <w:t xml:space="preserve">. By this he meant "those aspects of culture, the symbolic sphere of our existence, exemplified by religion and ideology, language and art, empirical science and formal science, that can be used to justify or legitimize direct or structural violence" (Galtung, 1990, p. 291). Religion is the first example on his list, which makes the concept especially useful for thinking about religiously framed conflicts.</w:t>
       </w:r>
     </w:p>
     <w:p>
@@ -524,7 +468,7 @@
         <w:rPr>
           <w:rFonts w:ascii="Times New Roman" w:cs="Times New Roman" w:eastAsia="Times New Roman" w:hAnsi="Times New Roman"/>
         </w:rPr>
-        <w:t xml:space="preserve">Galtung (1990) presents the three types as a triangle. Direct violence is an </w:t>
+        <w:t xml:space="preserve">Galtung (1990) pictures the three types of violence as the corners of a triangle. Direct violence is an </w:t>
       </w:r>
       <w:r>
         <w:rPr>
@@ -538,7 +482,7 @@
         <w:rPr>
           <w:rFonts w:ascii="Times New Roman" w:cs="Times New Roman" w:eastAsia="Times New Roman" w:hAnsi="Times New Roman"/>
         </w:rPr>
-        <w:t xml:space="preserve">, structural violence is a </w:t>
+        <w:t xml:space="preserve">. Structural violence is a </w:t>
       </w:r>
       <w:r>
         <w:rPr>
@@ -552,43 +496,29 @@
         <w:rPr>
           <w:rFonts w:ascii="Times New Roman" w:cs="Times New Roman" w:eastAsia="Times New Roman" w:hAnsi="Times New Roman"/>
         </w:rPr>
-        <w:t xml:space="preserve">, and cultural violence is an </w:t>
-      </w:r>
-      <w:r>
-        <w:rPr>
-          <w:rFonts w:ascii="Times New Roman" w:cs="Times New Roman" w:eastAsia="Times New Roman" w:hAnsi="Times New Roman"/>
-          <w:i/>
-          <w:iCs/>
-        </w:rPr>
-        <w:t xml:space="preserve">invariant</w:t>
-      </w:r>
-      <w:r>
-        <w:rPr>
-          <w:rFonts w:ascii="Times New Roman" w:cs="Times New Roman" w:eastAsia="Times New Roman" w:hAnsi="Times New Roman"/>
-        </w:rPr>
-        <w:t xml:space="preserve"> or "permanence" that changes very slowly. Cultural violence works by making direct and structural violence look right, or at least not wrong. It changes the moral colour of an act "from red/wrong to green/right or at least to yellow/acceptable" (Galtung, 1990, p. 292), and it makes reality opaque so that people do not see violent acts or structures as violent at all. Violence can flow in any direction around the triangle, but cultural violence is especially important because it lies underneath and feeds the other two.</w:t>
-      </w:r>
-    </w:p>
-    <w:p>
-      <w:pPr>
-        <w:pStyle w:val="Heading3"/>
-      </w:pPr>
-      <w:r>
-        <w:rPr>
-          <w:rFonts w:ascii="Times New Roman" w:cs="Times New Roman" w:eastAsia="Times New Roman" w:hAnsi="Times New Roman"/>
-        </w:rPr>
-        <w:t xml:space="preserve">Legitimation of direct violence</w:t>
-      </w:r>
-    </w:p>
-    <w:p>
-      <w:pPr>
-        <w:jc w:val="both"/>
-      </w:pPr>
-      <w:r>
-        <w:rPr>
-          <w:rFonts w:ascii="Times New Roman" w:cs="Times New Roman" w:eastAsia="Times New Roman" w:hAnsi="Times New Roman"/>
-        </w:rPr>
-        <w:t xml:space="preserve">Religion is one of Galtung's main examples. Religious traditions contain ideas that can be used to divide the world into the chosen and the unchosen, the saved and the damned, the faithful and the infidel. When these ideas are taken up by political actors, they can turn killing into a sacred duty. The concept of a "chosen people" with a divine claim to land, or the portrayal of enemies as agents of evil, makes violence against them seem justified. Juergensmeyer (2003) describes how religious activists imagine a "cosmic war" between good and evil, in which acts of terror become symbolic performances in a divine struggle. The Islamic State's use of the language of </w:t>
+        <w:t xml:space="preserve"> that unfolds over time. Cultural violence is the most durable of the three, a kind of background constant that changes only slowly. Its job is to make the other two look acceptable. In Galtung's memorable phrase, it shifts the moral colour of an act "from red/wrong to green/right or at least to yellow/acceptable" (Galtung, 1990, p. 292). It can also hide violence altogether, so that people simply do not see an act or an arrangement as violent. Violence can travel around the triangle in any direction, but cultural violence sits underneath and nourishes the rest.</w:t>
+      </w:r>
+    </w:p>
+    <w:p>
+      <w:pPr>
+        <w:pStyle w:val="Heading3"/>
+      </w:pPr>
+      <w:r>
+        <w:rPr>
+          <w:rFonts w:ascii="Times New Roman" w:cs="Times New Roman" w:eastAsia="Times New Roman" w:hAnsi="Times New Roman"/>
+        </w:rPr>
+        <w:t xml:space="preserve">Justifying direct violence</w:t>
+      </w:r>
+    </w:p>
+    <w:p>
+      <w:pPr>
+        <w:jc w:val="both"/>
+      </w:pPr>
+      <w:r>
+        <w:rPr>
+          <w:rFonts w:ascii="Times New Roman" w:cs="Times New Roman" w:eastAsia="Times New Roman" w:hAnsi="Times New Roman"/>
+        </w:rPr>
+        <w:t xml:space="preserve">Most religious traditions contain ideas that, in the wrong hands, can split the world into the chosen and the rest, the saved and the damned, believers and infidels. When politicians or militant leaders pick up these ideas, killing can be presented as a sacred duty. A "chosen people" with a divine title to land, or an enemy cast as the agent of evil, make violence seem not just permissible but righteous. Juergensmeyer (2003) describes how religious militants come to imagine themselves as soldiers in a "cosmic war" between good and evil, so that a bombing becomes a symbolic act in a divine drama. The examples are depressingly easy to find. The Islamic State used </w:t>
       </w:r>
       <w:r>
         <w:rPr>
@@ -602,18 +532,18 @@
         <w:rPr>
           <w:rFonts w:ascii="Times New Roman" w:cs="Times New Roman" w:eastAsia="Times New Roman" w:hAnsi="Times New Roman"/>
         </w:rPr>
-        <w:t xml:space="preserve"> (declaring other Muslims apostates) to justify massacres, the Lord's Resistance Army's use of biblical imagery in northern Uganda, the anti-Muslim rhetoric of radical Buddhist monks in Myanmar that preceded attacks on the Rohingya, and the use of religious labels by militias in the Central African Republic all illustrate how cultural violence prepares the ground for direct violence.</w:t>
-      </w:r>
-    </w:p>
-    <w:p>
-      <w:pPr>
-        <w:jc w:val="both"/>
-      </w:pPr>
-      <w:r>
-        <w:rPr>
-          <w:rFonts w:ascii="Times New Roman" w:cs="Times New Roman" w:eastAsia="Times New Roman" w:hAnsi="Times New Roman"/>
-        </w:rPr>
-        <w:t xml:space="preserve">Language plays a central role. Dehumanising labels, sermons, songs and media messages strip the "other" of humanity before any weapon is raised. The Rwandan genocide was not religious, but it shows the mechanism clearly: years of propaganda describing Tutsi as </w:t>
+        <w:t xml:space="preserve">, the practice of declaring other Muslims apostates, to justify massacres. The Lord's Resistance Army wrapped its brutality in biblical imagery. In Myanmar, radical Buddhist monks spent years preaching against Muslims before the attacks on the Rohingya, and in the Central African Republic religious labels became a way of marking out targets.</w:t>
+      </w:r>
+    </w:p>
+    <w:p>
+      <w:pPr>
+        <w:jc w:val="both"/>
+      </w:pPr>
+      <w:r>
+        <w:rPr>
+          <w:rFonts w:ascii="Times New Roman" w:cs="Times New Roman" w:eastAsia="Times New Roman" w:hAnsi="Times New Roman"/>
+        </w:rPr>
+        <w:t xml:space="preserve">Words do much of this work. Labels, sermons, songs and radio broadcasts can strip the "other" of their humanity long before anyone picks up a weapon. The Rwandan genocide was not a religious conflict, but it shows the process very clearly: years of propaganda calling Tutsi </w:t>
       </w:r>
       <w:r>
         <w:rPr>
@@ -627,84 +557,84 @@
         <w:rPr>
           <w:rFonts w:ascii="Times New Roman" w:cs="Times New Roman" w:eastAsia="Times New Roman" w:hAnsi="Times New Roman"/>
         </w:rPr>
-        <w:t xml:space="preserve"> ("cockroaches") made mass killing thinkable. In religiously framed conflicts, similar labels such as "infidel", "apostate" or "crusader" perform the same work.</w:t>
-      </w:r>
-    </w:p>
-    <w:p>
-      <w:pPr>
-        <w:pStyle w:val="Heading3"/>
-      </w:pPr>
-      <w:r>
-        <w:rPr>
-          <w:rFonts w:ascii="Times New Roman" w:cs="Times New Roman" w:eastAsia="Times New Roman" w:hAnsi="Times New Roman"/>
-        </w:rPr>
-        <w:t xml:space="preserve">Legitimation and perpetuation of structural violence</w:t>
-      </w:r>
-    </w:p>
-    <w:p>
-      <w:pPr>
-        <w:jc w:val="both"/>
-      </w:pPr>
-      <w:r>
-        <w:rPr>
-          <w:rFonts w:ascii="Times New Roman" w:cs="Times New Roman" w:eastAsia="Times New Roman" w:hAnsi="Times New Roman"/>
-        </w:rPr>
-        <w:t xml:space="preserve">Cultural violence also explains why structural violence can persist for long periods without provoking outrage. Religious and cultural ideas can present unequal arrangements as natural, divinely ordained or deserved. The Hindu caste system, which has historically justified the exclusion of Dalits from land, education and temples, is a classic example that Galtung himself discusses. Interpretations of religious texts have also been used to justify the subordination of women, the denial of citizenship rights to religious minorities and the economic marginalisation of particular communities. In Myanmar, the 1982 citizenship law effectively rendered the Rohingya stateless, a structural exclusion that was sustained by a narrative depicting them as foreign "Bengali" intruders in a Buddhist nation. Once such ideas are widely accepted, discrimination comes to look like common sense.</w:t>
-      </w:r>
-    </w:p>
-    <w:p>
-      <w:pPr>
-        <w:pStyle w:val="Heading3"/>
-      </w:pPr>
-      <w:r>
-        <w:rPr>
-          <w:rFonts w:ascii="Times New Roman" w:cs="Times New Roman" w:eastAsia="Times New Roman" w:hAnsi="Times New Roman"/>
-        </w:rPr>
-        <w:t xml:space="preserve">How the cycle is perpetuated</w:t>
-      </w:r>
-    </w:p>
-    <w:p>
-      <w:pPr>
-        <w:jc w:val="both"/>
-      </w:pPr>
-      <w:r>
-        <w:rPr>
-          <w:rFonts w:ascii="Times New Roman" w:cs="Times New Roman" w:eastAsia="Times New Roman" w:hAnsi="Times New Roman"/>
-        </w:rPr>
-        <w:t xml:space="preserve">The value of the concept lies in showing how the three types of violence reinforce each other over time. Structural violence, such as the exclusion of a religious minority from land, jobs or political power, generates grievance. Cultural violence frames that grievance in religious terms, both for the excluded group (who may come to see their suffering as persecution of the faith) and for the dominant group (who may see the minority as a threat). Eventually direct violence erupts. After the fighting, memories of martyrdom, desecrated sites and atrocities are absorbed into religious narratives, songs and commemorations, creating fresh cultural violence that will justify the next round. In this way, conflicts become self-perpetuating, as has been seen in the cycles of violence in Nigeria's Plateau State or in sectarian conflict in Iraq.</w:t>
-      </w:r>
-    </w:p>
-    <w:p>
-      <w:pPr>
-        <w:pStyle w:val="Heading3"/>
-      </w:pPr>
-      <w:r>
-        <w:rPr>
-          <w:rFonts w:ascii="Times New Roman" w:cs="Times New Roman" w:eastAsia="Times New Roman" w:hAnsi="Times New Roman"/>
-        </w:rPr>
-        <w:t xml:space="preserve">Strengths and limitations</w:t>
-      </w:r>
-    </w:p>
-    <w:p>
-      <w:pPr>
-        <w:jc w:val="both"/>
-      </w:pPr>
-      <w:r>
-        <w:rPr>
-          <w:rFonts w:ascii="Times New Roman" w:cs="Times New Roman" w:eastAsia="Times New Roman" w:hAnsi="Times New Roman"/>
-        </w:rPr>
-        <w:t xml:space="preserve">The main strength of the concept is that it directs attention beyond the battlefield to the ideas, symbols and narratives that make violence possible. It also explains why peace agreements that end direct violence often fail to produce lasting peace: unless structural and cultural violence are addressed, the conditions for renewed conflict remain. This has practical implications for peacebuilding, including the reform of school curricula, interfaith dialogue, counter-narratives from religious leaders and attention to hate speech in the media.</w:t>
-      </w:r>
-    </w:p>
-    <w:p>
-      <w:pPr>
-        <w:jc w:val="both"/>
-      </w:pPr>
-      <w:r>
-        <w:rPr>
-          <w:rFonts w:ascii="Times New Roman" w:cs="Times New Roman" w:eastAsia="Times New Roman" w:hAnsi="Times New Roman"/>
-        </w:rPr>
-        <w:t xml:space="preserve">The concept also has limitations. Critics argue that "violence" becomes so broad that it loses analytical precision; if almost any cultural element can be violent, the term risks becoming a label for anything the analyst disapproves of. The concept also says relatively little about agency: it identifies cultural resources that </w:t>
+        <w:t xml:space="preserve">, or "cockroaches", helped make mass murder thinkable. In religious conflicts, words like "infidel", "apostate" and "crusader" play the same role.</w:t>
+      </w:r>
+    </w:p>
+    <w:p>
+      <w:pPr>
+        <w:pStyle w:val="Heading3"/>
+      </w:pPr>
+      <w:r>
+        <w:rPr>
+          <w:rFonts w:ascii="Times New Roman" w:cs="Times New Roman" w:eastAsia="Times New Roman" w:hAnsi="Times New Roman"/>
+        </w:rPr>
+        <w:t xml:space="preserve">Justifying and sustaining structural violence</w:t>
+      </w:r>
+    </w:p>
+    <w:p>
+      <w:pPr>
+        <w:jc w:val="both"/>
+      </w:pPr>
+      <w:r>
+        <w:rPr>
+          <w:rFonts w:ascii="Times New Roman" w:cs="Times New Roman" w:eastAsia="Times New Roman" w:hAnsi="Times New Roman"/>
+        </w:rPr>
+        <w:t xml:space="preserve">Cultural violence also helps explain how deep injustice can last for generations without causing much outrage. Religious and cultural ideas can make unequal arrangements look natural, God-given or deserved. Galtung himself points to the Hindu caste system, which has for centuries been used to keep Dalits away from land, schooling and temples. Readings of sacred texts have likewise been used to justify keeping women in subordinate roles, denying religious minorities full citizenship and pushing particular communities to the economic margins. Myanmar again provides a stark case. Its 1982 citizenship law left the Rohingya effectively stateless, and that exclusion was propped up by a story that cast them as foreign "Bengali" intruders in a Buddhist country. Once ideas like these are widely held, discrimination simply looks like common sense.</w:t>
+      </w:r>
+    </w:p>
+    <w:p>
+      <w:pPr>
+        <w:pStyle w:val="Heading3"/>
+      </w:pPr>
+      <w:r>
+        <w:rPr>
+          <w:rFonts w:ascii="Times New Roman" w:cs="Times New Roman" w:eastAsia="Times New Roman" w:hAnsi="Times New Roman"/>
+        </w:rPr>
+        <w:t xml:space="preserve">How the cycle keeps turning</w:t>
+      </w:r>
+    </w:p>
+    <w:p>
+      <w:pPr>
+        <w:jc w:val="both"/>
+      </w:pPr>
+      <w:r>
+        <w:rPr>
+          <w:rFonts w:ascii="Times New Roman" w:cs="Times New Roman" w:eastAsia="Times New Roman" w:hAnsi="Times New Roman"/>
+        </w:rPr>
+        <w:t xml:space="preserve">For me, the real value of the concept is the way it shows the three types of violence feeding one another over time. Structural violence, such as shutting a religious minority out of land, jobs or political office, breeds resentment. Cultural violence then gives that resentment a religious shape. The excluded group may come to see its suffering as persecution of the faith, while the dominant group sees the minority as a threat. Sooner or later direct violence breaks out. Afterwards, memories of martyrs, desecrated shrines and massacres find their way into sermons, songs and commemorations, creating fresh cultural violence that will be used to justify the next round. This is how conflicts become self-sustaining, as the repeated cycles of killing in Nigeria's Plateau State and the sectarian violence in Iraq both show.</w:t>
+      </w:r>
+    </w:p>
+    <w:p>
+      <w:pPr>
+        <w:pStyle w:val="Heading3"/>
+      </w:pPr>
+      <w:r>
+        <w:rPr>
+          <w:rFonts w:ascii="Times New Roman" w:cs="Times New Roman" w:eastAsia="Times New Roman" w:hAnsi="Times New Roman"/>
+        </w:rPr>
+        <w:t xml:space="preserve">Strengths and weaknesses</w:t>
+      </w:r>
+    </w:p>
+    <w:p>
+      <w:pPr>
+        <w:jc w:val="both"/>
+      </w:pPr>
+      <w:r>
+        <w:rPr>
+          <w:rFonts w:ascii="Times New Roman" w:cs="Times New Roman" w:eastAsia="Times New Roman" w:hAnsi="Times New Roman"/>
+        </w:rPr>
+        <w:t xml:space="preserve">The concept's great strength is that it makes us look beyond the battlefield, at the ideas, symbols and stories that make violence possible in the first place. It also helps explain why so many peace agreements fail. A ceasefire may stop the shooting, but if the structures and the cultural narratives behind the conflict are left untouched, the conditions for a new war remain. This has practical consequences for peacebuilding, including reforming school curricula, supporting interfaith dialogue, encouraging religious leaders to offer counter-narratives and tackling hate speech in the media.</w:t>
+      </w:r>
+    </w:p>
+    <w:p>
+      <w:pPr>
+        <w:jc w:val="both"/>
+      </w:pPr>
+      <w:r>
+        <w:rPr>
+          <w:rFonts w:ascii="Times New Roman" w:cs="Times New Roman" w:eastAsia="Times New Roman" w:hAnsi="Times New Roman"/>
+        </w:rPr>
+        <w:t xml:space="preserve">There are weaknesses too. Some critics feel that Galtung stretches the word "violence" so far that it loses its edge; if almost any part of culture can count as violent, the term risks becoming a label for whatever the analyst dislikes. The concept is also thin on agency. It identifies the cultural resources that </w:t>
       </w:r>
       <w:r>
         <w:rPr>
@@ -718,7 +648,7 @@
         <w:rPr>
           <w:rFonts w:ascii="Times New Roman" w:cs="Times New Roman" w:eastAsia="Times New Roman" w:hAnsi="Times New Roman"/>
         </w:rPr>
-        <w:t xml:space="preserve"> legitimise violence but does not explain why certain actors choose to activate them at particular moments. For that, Galtung's framework needs to be combined with instrumentalist and constructivist accounts of how elites mobilise identity (discussed in Questions 4 and 5). Finally, it can underplay the fact that religion also provides strong cultural resources for peace, what Galtung himself called </w:t>
+        <w:t xml:space="preserve"> justify violence, but it does not explain why particular people choose to use them at particular moments. To answer that question, Galtung's framework has to be combined with instrumentalist and constructivist accounts of how identities are mobilised, which I take up in Questions 4 and 5. Finally, the concept can make religion look like a source of violence only, when it is just as often a source of peace, something Galtung himself recognised with the idea of </w:t>
       </w:r>
       <w:r>
         <w:rPr>
@@ -732,7 +662,7 @@
         <w:rPr>
           <w:rFonts w:ascii="Times New Roman" w:cs="Times New Roman" w:eastAsia="Times New Roman" w:hAnsi="Times New Roman"/>
         </w:rPr>
-        <w:t xml:space="preserve"> and what Appleby (2000) calls the ambivalence of the sacred.</w:t>
+        <w:t xml:space="preserve">, and which Appleby (2000) captures in the "ambivalence of the sacred".</w:t>
       </w:r>
     </w:p>
     <w:p>
@@ -754,7 +684,7 @@
         <w:rPr>
           <w:rFonts w:ascii="Times New Roman" w:cs="Times New Roman" w:eastAsia="Times New Roman" w:hAnsi="Times New Roman"/>
         </w:rPr>
-        <w:t xml:space="preserve">Galtung's concept of cultural violence is a useful lens for understanding religiously framed conflicts. It shows how religious ideas, language and symbols can make killing seem righteous, make inequality seem natural and keep cycles of violence going long after the original disputes have faded. Its greatest contribution is the reminder that lasting peace requires transforming not only behaviour and structures but also the cultural narratives that justify them.</w:t>
+        <w:t xml:space="preserve">Galtung's idea of cultural violence is a valuable tool for understanding religiously framed conflicts. It shows how religious ideas, language and symbols can make killing look righteous, make inequality look natural and keep conflicts going long after their original causes have faded. Above all, it reminds us that lasting peace depends on changing not only behaviour and institutions but also the stories people tell to justify harm.</w:t>
       </w:r>
     </w:p>
     <w:p>
@@ -787,128 +717,128 @@
         <w:rPr>
           <w:rFonts w:ascii="Times New Roman" w:cs="Times New Roman" w:eastAsia="Times New Roman" w:hAnsi="Times New Roman"/>
         </w:rPr>
-        <w:t xml:space="preserve">Why do people fight in the name of religion, ethnicity or culture? Scholars have answered this question from two broad positions. Primordialists see such identities as deep, enduring and emotionally powerful attachments that people are born into. Instrumentalists see them as flexible resources that are activated and manipulated, usually by elites, in pursuit of power and material interests. The debate matters because each position implies a different explanation of conflict and a different approach to building peace.</w:t>
-      </w:r>
-    </w:p>
-    <w:p>
-      <w:pPr>
-        <w:pStyle w:val="Heading3"/>
-      </w:pPr>
-      <w:r>
-        <w:rPr>
-          <w:rFonts w:ascii="Times New Roman" w:cs="Times New Roman" w:eastAsia="Times New Roman" w:hAnsi="Times New Roman"/>
-        </w:rPr>
-        <w:t xml:space="preserve">The primordialist approach</w:t>
-      </w:r>
-    </w:p>
-    <w:p>
-      <w:pPr>
-        <w:jc w:val="both"/>
-      </w:pPr>
-      <w:r>
-        <w:rPr>
-          <w:rFonts w:ascii="Times New Roman" w:cs="Times New Roman" w:eastAsia="Times New Roman" w:hAnsi="Times New Roman"/>
-        </w:rPr>
-        <w:t xml:space="preserve">The primordialist approach draws on the work of Edward Shils (1957) and Clifford Geertz (1963). Geertz described "primordial attachments" as the ties that stem from the "assumed givens" of social existence: kinship, religion, language, region and custom. These ties have an "ineffable, and at times overpowering, coerciveness in and of themselves" (Geertz, 1963, p. 109). Harold Isaacs (1975) likewise wrote of the "basic group identity" that people acquire at birth. For primordialists, religious and ethnic identities are not chosen; they are deeply felt, passed down across generations and tied to ideas of common ancestry, sacred history and shared destiny.</w:t>
-      </w:r>
-    </w:p>
-    <w:p>
-      <w:pPr>
-        <w:jc w:val="both"/>
-      </w:pPr>
-      <w:r>
-        <w:rPr>
-          <w:rFonts w:ascii="Times New Roman" w:cs="Times New Roman" w:eastAsia="Times New Roman" w:hAnsi="Times New Roman"/>
-        </w:rPr>
-        <w:t xml:space="preserve">Applied to conflict, primordialism suggests that violence between groups grows out of long-standing differences and historical antagonisms. Popular accounts of the wars in the former Yugoslavia as the eruption of "ancient hatreds", or of Sunni–Shia violence as a continuation of a seventh-century split, reflect a crude version of this view. Huntington's clash of civilizations also has a primordial flavour, since it treats cultural and religious identities as stable and as the natural basis of political loyalty.</w:t>
-      </w:r>
-    </w:p>
-    <w:p>
-      <w:pPr>
-        <w:jc w:val="both"/>
-      </w:pPr>
-      <w:r>
-        <w:rPr>
-          <w:rFonts w:ascii="Times New Roman" w:cs="Times New Roman" w:eastAsia="Times New Roman" w:hAnsi="Times New Roman"/>
-        </w:rPr>
-        <w:t xml:space="preserve">Primordialism has real strengths. It takes seriously the emotional intensity of identity, which explains why people are willing to die for their faith or nation in a way they are rarely willing to die for an economic interest. It explains the persistence of identities over long periods, and it captures the way people themselves experience their identity: most believers do not regard their faith as a tool. Kaufman (2001), while not a strict primordialist, shows that "symbolic politics", rooted in myths, fears and emotional symbols, is central to ethnic war.</w:t>
-      </w:r>
-    </w:p>
-    <w:p>
-      <w:pPr>
-        <w:jc w:val="both"/>
-      </w:pPr>
-      <w:r>
-        <w:rPr>
-          <w:rFonts w:ascii="Times New Roman" w:cs="Times New Roman" w:eastAsia="Times New Roman" w:hAnsi="Times New Roman"/>
-        </w:rPr>
-        <w:t xml:space="preserve">Its weaknesses, however, are considerable. If identities are fixed and conflict flows from them, it cannot explain why groups live peacefully together for long periods and then suddenly turn on each other, or why violence occurs at some times and places but not others. Hindus and Muslims in India, or Christians and Muslims in much of East Africa, have coexisted peacefully far more often than they have fought. Primordialism also struggles to account for change: identities appear, merge, split and disappear over time. And the "ancient hatreds" narrative can be politically convenient, since it suggests that conflicts are inevitable and that outsiders can do little to prevent them.</w:t>
-      </w:r>
-    </w:p>
-    <w:p>
-      <w:pPr>
-        <w:pStyle w:val="Heading3"/>
-      </w:pPr>
-      <w:r>
-        <w:rPr>
-          <w:rFonts w:ascii="Times New Roman" w:cs="Times New Roman" w:eastAsia="Times New Roman" w:hAnsi="Times New Roman"/>
-        </w:rPr>
-        <w:t xml:space="preserve">The instrumentalist approach</w:t>
-      </w:r>
-    </w:p>
-    <w:p>
-      <w:pPr>
-        <w:jc w:val="both"/>
-      </w:pPr>
-      <w:r>
-        <w:rPr>
-          <w:rFonts w:ascii="Times New Roman" w:cs="Times New Roman" w:eastAsia="Times New Roman" w:hAnsi="Times New Roman"/>
-        </w:rPr>
-        <w:t xml:space="preserve">Instrumentalists such as Paul Brass (1991, 1997) argue that identities are better understood as resources that political and economic elites select, shape and mobilise for their own purposes. Elites emphasise certain cultural differences, distort others and frame competition over power, land or jobs as a defence of the group. Violence, in this view, is often organised. Brass's (1997) work on Hindu–Muslim riots in northern India shows how what appear to be spontaneous communal clashes are frequently produced by "institutionalised riot systems" of politicians, activists and criminals who benefit from polarisation, particularly around elections.</w:t>
-      </w:r>
-    </w:p>
-    <w:p>
-      <w:pPr>
-        <w:jc w:val="both"/>
-      </w:pPr>
-      <w:r>
-        <w:rPr>
-          <w:rFonts w:ascii="Times New Roman" w:cs="Times New Roman" w:eastAsia="Times New Roman" w:hAnsi="Times New Roman"/>
-        </w:rPr>
-        <w:t xml:space="preserve">Instrumentalism has wide support in the evidence. As discussed under Question 2, studies of civil war find that grievances over power and resources, together with state weakness, explain conflict onset better than cultural diversity alone (Collier &amp; Hoeffler, 2004; Fearon &amp; Laitin, 2003). Case studies show how leaders manipulate identity in times of political crisis. In Kenya, for example, the ethnic violence around the 1992, 1997 and 2007–2008 elections was not the product of age-old tribal hatred but was organised and financed by political actors competing for power and land. Sectarian mobilisation in the Middle East after 2011 also fits the instrumentalist account (Hashemi &amp; Postel, 2017).</w:t>
-      </w:r>
-    </w:p>
-    <w:p>
-      <w:pPr>
-        <w:jc w:val="both"/>
-      </w:pPr>
-      <w:r>
-        <w:rPr>
-          <w:rFonts w:ascii="Times New Roman" w:cs="Times New Roman" w:eastAsia="Times New Roman" w:hAnsi="Times New Roman"/>
-        </w:rPr>
-        <w:t xml:space="preserve">Yet instrumentalism has its own weaknesses. It sometimes portrays ordinary people as passive dupes who can be steered into violence by elites, without explaining why they follow. If identity is merely a tool, why does it resonate so strongly, and why are some appeals successful while others fail? Elites cannot invent identities from nothing; they must work with symbols and memories that already mean something to people. Instrumentalism also struggles to explain cases where people act against their material interests for the sake of religious or cultural commitments, such as martyrdom or the refusal to compromise over sacred sites. Finally, by treating religion as a cover for "real" interests, it can underestimate the independent force of belief.</w:t>
-      </w:r>
-    </w:p>
-    <w:p>
-      <w:pPr>
-        <w:pStyle w:val="Heading3"/>
-      </w:pPr>
-      <w:r>
-        <w:rPr>
-          <w:rFonts w:ascii="Times New Roman" w:cs="Times New Roman" w:eastAsia="Times New Roman" w:hAnsi="Times New Roman"/>
-        </w:rPr>
-        <w:t xml:space="preserve">Assessment of the debate</w:t>
-      </w:r>
-    </w:p>
-    <w:p>
-      <w:pPr>
-        <w:jc w:val="both"/>
-      </w:pPr>
-      <w:r>
-        <w:rPr>
-          <w:rFonts w:ascii="Times New Roman" w:cs="Times New Roman" w:eastAsia="Times New Roman" w:hAnsi="Times New Roman"/>
-        </w:rPr>
-        <w:t xml:space="preserve">In practice, the two approaches capture different parts of the same reality. Primordialism explains why identities are emotionally powerful; instrumentalism explains how and when that power is harnessed for conflict. Elites can only mobilise identities that people already care about, and identities become dangerous mostly when someone has an interest in making them so. Most scholars today therefore reject a strict choice between the two. Horowitz (1985), for instance, combines attention to group emotions, status and fear with an analysis of political competition. The most influential attempt to move beyond the dichotomy, however, has come from constructivism, which is the subject of Question 5.</w:t>
+        <w:t xml:space="preserve">Why are people prepared to fight, and sometimes die, in the name of their religion, ethnic group or culture? Broadly speaking, scholars have offered two answers. Primordialists say that these identities are deep, lasting and emotionally powerful bonds that people are born into. Instrumentalists say they are flexible resources that are switched on and manipulated, usually by elites, in the pursuit of power and material gain. The debate is not just academic. Each answer points to a different explanation of conflict, and to a different idea of how peace might be built.</w:t>
+      </w:r>
+    </w:p>
+    <w:p>
+      <w:pPr>
+        <w:pStyle w:val="Heading3"/>
+      </w:pPr>
+      <w:r>
+        <w:rPr>
+          <w:rFonts w:ascii="Times New Roman" w:cs="Times New Roman" w:eastAsia="Times New Roman" w:hAnsi="Times New Roman"/>
+        </w:rPr>
+        <w:t xml:space="preserve">Primordialism</w:t>
+      </w:r>
+    </w:p>
+    <w:p>
+      <w:pPr>
+        <w:jc w:val="both"/>
+      </w:pPr>
+      <w:r>
+        <w:rPr>
+          <w:rFonts w:ascii="Times New Roman" w:cs="Times New Roman" w:eastAsia="Times New Roman" w:hAnsi="Times New Roman"/>
+        </w:rPr>
+        <w:t xml:space="preserve">The primordialist position goes back to Edward Shils (1957) and Clifford Geertz (1963). Geertz wrote of "primordial attachments", the bonds that grow out of the "assumed givens" of social life, such as kinship, religion, language, region and custom. These bonds, he said, have an "ineffable, and at times overpowering, coerciveness in and of themselves" (Geertz, 1963, p. 109). Harold Isaacs (1975) similarly described a "basic group identity" acquired at birth. On this view, religious and ethnic identities are not chosen. They are felt deeply, handed down from one generation to the next and bound up with ideas of shared ancestry, sacred history and common destiny.</w:t>
+      </w:r>
+    </w:p>
+    <w:p>
+      <w:pPr>
+        <w:jc w:val="both"/>
+      </w:pPr>
+      <w:r>
+        <w:rPr>
+          <w:rFonts w:ascii="Times New Roman" w:cs="Times New Roman" w:eastAsia="Times New Roman" w:hAnsi="Times New Roman"/>
+        </w:rPr>
+        <w:t xml:space="preserve">When primordialists turn to conflict, they tend to see violence as the outgrowth of deep-rooted differences and old rivalries. Popular accounts of the Balkan wars as the return of "ancient hatreds", or of Sunni–Shia violence as the continuation of a seventh-century quarrel, are crude versions of this argument. Huntington's clash of civilizations has a primordial flavour as well, since it treats cultural and religious identities as stable and as the natural basis of political loyalty.</w:t>
+      </w:r>
+    </w:p>
+    <w:p>
+      <w:pPr>
+        <w:jc w:val="both"/>
+      </w:pPr>
+      <w:r>
+        <w:rPr>
+          <w:rFonts w:ascii="Times New Roman" w:cs="Times New Roman" w:eastAsia="Times New Roman" w:hAnsi="Times New Roman"/>
+        </w:rPr>
+        <w:t xml:space="preserve">Primordialism does capture some important truths. It takes seriously the emotional force of identity, which helps explain why people will die for their faith or their nation in a way they rarely will for an economic interest. It accounts for the remarkable staying power of some identities over centuries. And it matches how most people actually experience their identity; very few believers think of their faith as a tool. Kaufman (2001), though not a primordialist in the strict sense, shows how myths, fears and emotive symbols, which he calls "symbolic politics", lie at the heart of ethnic war.</w:t>
+      </w:r>
+    </w:p>
+    <w:p>
+      <w:pPr>
+        <w:jc w:val="both"/>
+      </w:pPr>
+      <w:r>
+        <w:rPr>
+          <w:rFonts w:ascii="Times New Roman" w:cs="Times New Roman" w:eastAsia="Times New Roman" w:hAnsi="Times New Roman"/>
+        </w:rPr>
+        <w:t xml:space="preserve">Its weaknesses are just as real. If identities are fixed and conflict springs from them, why do groups live peacefully together for long periods and then suddenly turn on one another? Why does violence erupt in some places and at some times but not others? Hindus and Muslims in India, and Christians and Muslims across most of East Africa, have lived together in peace far more often than they have fought. Primordialism also has trouble explaining change, since identities are born, merge, split and fade away over time. And the "ancient hatreds" story can be politically convenient, because it suggests that conflict is inevitable and that nothing much can be done to prevent it.</w:t>
+      </w:r>
+    </w:p>
+    <w:p>
+      <w:pPr>
+        <w:pStyle w:val="Heading3"/>
+      </w:pPr>
+      <w:r>
+        <w:rPr>
+          <w:rFonts w:ascii="Times New Roman" w:cs="Times New Roman" w:eastAsia="Times New Roman" w:hAnsi="Times New Roman"/>
+        </w:rPr>
+        <w:t xml:space="preserve">Instrumentalism</w:t>
+      </w:r>
+    </w:p>
+    <w:p>
+      <w:pPr>
+        <w:jc w:val="both"/>
+      </w:pPr>
+      <w:r>
+        <w:rPr>
+          <w:rFonts w:ascii="Times New Roman" w:cs="Times New Roman" w:eastAsia="Times New Roman" w:hAnsi="Times New Roman"/>
+        </w:rPr>
+        <w:t xml:space="preserve">Instrumentalists such as Paul Brass (1991, 1997) see identity quite differently. For them it is a resource that political and economic elites pick up, reshape and deploy for their own ends. Leaders play up some cultural differences, play down others and present competition over power, land or jobs as a fight to defend the group. Violence, on this view, is often organised rather than spontaneous. Brass's (1997) study of Hindu–Muslim riots in northern India shows that apparently spontaneous communal clashes were frequently the work of "institutionalised riot systems", networks of politicians, activists and criminals who stood to gain from polarisation, especially around elections.</w:t>
+      </w:r>
+    </w:p>
+    <w:p>
+      <w:pPr>
+        <w:jc w:val="both"/>
+      </w:pPr>
+      <w:r>
+        <w:rPr>
+          <w:rFonts w:ascii="Times New Roman" w:cs="Times New Roman" w:eastAsia="Times New Roman" w:hAnsi="Times New Roman"/>
+        </w:rPr>
+        <w:t xml:space="preserve">There is a lot of evidence on the instrumentalists' side. As I noted in Question 2, studies of civil war find that disputes over power and resources, combined with weak states, explain the outbreak of conflict better than cultural diversity does (Collier &amp; Hoeffler, 2004; Fearon &amp; Laitin, 2003). Case studies keep showing leaders manipulating identity in moments of political crisis. Kenya's own history is a clear example. The ethnic violence around the elections of 1992, 1997 and 2007–2008 was not the product of age-old tribal hatred. It was organised and paid for by politicians competing for power and land. The sectarian mobilisation in the Middle East after 2011 fits the same pattern (Hashemi &amp; Postel, 2017).</w:t>
+      </w:r>
+    </w:p>
+    <w:p>
+      <w:pPr>
+        <w:jc w:val="both"/>
+      </w:pPr>
+      <w:r>
+        <w:rPr>
+          <w:rFonts w:ascii="Times New Roman" w:cs="Times New Roman" w:eastAsia="Times New Roman" w:hAnsi="Times New Roman"/>
+        </w:rPr>
+        <w:t xml:space="preserve">But instrumentalism has blind spots of its own. It can make ordinary people look like puppets who are easily led into violence, without explaining why they go along. If identity is only a tool, why does it carry so much emotional weight, and why do some appeals catch fire while others fall flat? Elites cannot conjure identities out of thin air. They have to work with symbols and memories that already mean something to people. Instrumentalism also struggles with cases where people act against their material interests for the sake of belief, such as accepting martyrdom or refusing any compromise over a holy site. By treating religion as a cover for "real" interests, it can underestimate the power of faith itself.</w:t>
+      </w:r>
+    </w:p>
+    <w:p>
+      <w:pPr>
+        <w:pStyle w:val="Heading3"/>
+      </w:pPr>
+      <w:r>
+        <w:rPr>
+          <w:rFonts w:ascii="Times New Roman" w:cs="Times New Roman" w:eastAsia="Times New Roman" w:hAnsi="Times New Roman"/>
+        </w:rPr>
+        <w:t xml:space="preserve">Weighing up the debate</w:t>
+      </w:r>
+    </w:p>
+    <w:p>
+      <w:pPr>
+        <w:jc w:val="both"/>
+      </w:pPr>
+      <w:r>
+        <w:rPr>
+          <w:rFonts w:ascii="Times New Roman" w:cs="Times New Roman" w:eastAsia="Times New Roman" w:hAnsi="Times New Roman"/>
+        </w:rPr>
+        <w:t xml:space="preserve">In the end, I think each approach explains a different part of the same picture. Primordialism tells us why identities are so emotionally powerful; instrumentalism tells us how and when that power is put to use in conflict. Leaders can only mobilise identities that people already care about, and identities tend to become dangerous mainly when someone stands to gain from making them so. That is why most scholars now refuse to choose strictly between the two. Horowitz (1985), for example, combines attention to group emotions, status and fear with a close analysis of political competition. The most influential attempt to get beyond the dichotomy, however, has come from constructivism, which is the subject of the next question.</w:t>
       </w:r>
     </w:p>
     <w:p>
@@ -941,142 +871,142 @@
         <w:rPr>
           <w:rFonts w:ascii="Times New Roman" w:cs="Times New Roman" w:eastAsia="Times New Roman" w:hAnsi="Times New Roman"/>
         </w:rPr>
-        <w:t xml:space="preserve">Constructivism begins from the premise that social realities, including identities, are created and sustained through human interaction, shared meanings and institutions. In international relations, Wendt (1992) famously argued that "anarchy is what states make of it": even the structures that seem most fixed are products of shared understandings. Applied to religion and ethnicity, constructivism holds that identities are neither primordial givens nor simple tools of elites. They are social constructions that are made and remade over time through history, institutions, discourse and everyday practice.</w:t>
-      </w:r>
-    </w:p>
-    <w:p>
-      <w:pPr>
-        <w:pStyle w:val="Heading3"/>
-      </w:pPr>
-      <w:r>
-        <w:rPr>
-          <w:rFonts w:ascii="Times New Roman" w:cs="Times New Roman" w:eastAsia="Times New Roman" w:hAnsi="Times New Roman"/>
-        </w:rPr>
-        <w:t xml:space="preserve">How constructivism bridges the dichotomy</w:t>
-      </w:r>
-    </w:p>
-    <w:p>
-      <w:pPr>
-        <w:jc w:val="both"/>
-      </w:pPr>
-      <w:r>
-        <w:rPr>
-          <w:rFonts w:ascii="Times New Roman" w:cs="Times New Roman" w:eastAsia="Times New Roman" w:hAnsi="Times New Roman"/>
-        </w:rPr>
-        <w:t xml:space="preserve">Constructivism bridges the two approaches in several ways. First, it accepts the primordialist point that identities can feel natural, ancient and deeply meaningful to the people who hold them. Benedict Anderson (1983/2006) described nations as "imagined communities"; they are imagined not in the sense of being false, but because members feel a deep bond with millions of people they will never meet. Constructivists explain this feeling as the </w:t>
-      </w:r>
-      <w:r>
-        <w:rPr>
-          <w:rFonts w:ascii="Times New Roman" w:cs="Times New Roman" w:eastAsia="Times New Roman" w:hAnsi="Times New Roman"/>
-          <w:i/>
-          <w:iCs/>
-        </w:rPr>
-        <w:t xml:space="preserve">product</w:t>
-      </w:r>
-      <w:r>
-        <w:rPr>
-          <w:rFonts w:ascii="Times New Roman" w:cs="Times New Roman" w:eastAsia="Times New Roman" w:hAnsi="Times New Roman"/>
-        </w:rPr>
-        <w:t xml:space="preserve"> of social processes such as education, print media, religious ritual, colonial classification and state policy, rather than as a biological or pre-social fact. Identities are constructed, but once constructed they are real in their consequences.</w:t>
-      </w:r>
-    </w:p>
-    <w:p>
-      <w:pPr>
-        <w:jc w:val="both"/>
-      </w:pPr>
-      <w:r>
-        <w:rPr>
-          <w:rFonts w:ascii="Times New Roman" w:cs="Times New Roman" w:eastAsia="Times New Roman" w:hAnsi="Times New Roman"/>
-        </w:rPr>
-        <w:t xml:space="preserve">Second, constructivism accepts the instrumentalist point that elites shape identities and use them strategically, but it adds that elites are themselves shaped by the identities and narratives available in their society, and that they can only succeed when their appeals resonate with existing meanings. Fearon and Laitin (2000) show that much of the research on the social construction of ethnic identity points to a mix of elite strategy, the actions of ordinary people and the long-term effects of discourse. Violence itself can construct identities, hardening boundaries that had previously been fluid.</w:t>
-      </w:r>
-    </w:p>
-    <w:p>
-      <w:pPr>
-        <w:jc w:val="both"/>
-      </w:pPr>
-      <w:r>
-        <w:rPr>
-          <w:rFonts w:ascii="Times New Roman" w:cs="Times New Roman" w:eastAsia="Times New Roman" w:hAnsi="Times New Roman"/>
-        </w:rPr>
-        <w:t xml:space="preserve">Third, constructivism explains change and variation, which neither of the older approaches handles well. Because identities depend on context, the same people may emphasise their religion in one situation and their nationality, clan or profession in another. Brubaker (2004) warns against "groupism", the habit of treating ethnic and religious groups as fixed, bounded actors. He suggests instead that we study how "groupness" rises and falls as a contingent event: how, at particular moments, people come to see and act as members of a group. This approach explains why Christian–Muslim relations in a town may be peaceful for decades and then suddenly break down when political competition, rumour and fear crystallise group boundaries.</w:t>
-      </w:r>
-    </w:p>
-    <w:p>
-      <w:pPr>
-        <w:jc w:val="both"/>
-      </w:pPr>
-      <w:r>
-        <w:rPr>
-          <w:rFonts w:ascii="Times New Roman" w:cs="Times New Roman" w:eastAsia="Times New Roman" w:hAnsi="Times New Roman"/>
-        </w:rPr>
-        <w:t xml:space="preserve">African history offers powerful illustrations. Mamdani (2001) shows that the Hutu–Tutsi distinction in Rwanda, often presented as an ancient ethnic divide, was profoundly reshaped by Belgian colonial rule, which turned a fluid social and political distinction into a fixed racial classification recorded on identity cards. Post-colonial politics then built on this construction until it became the basis of genocide. The identities were constructed, yet they were felt intensely; they were manipulated by elites, yet the manipulation worked because colonial institutions had made the categories meaningful. The case shows how constructivism holds together the insights of both primordialism and instrumentalism.</w:t>
-      </w:r>
-    </w:p>
-    <w:p>
-      <w:pPr>
-        <w:pStyle w:val="Heading3"/>
-      </w:pPr>
-      <w:r>
-        <w:rPr>
-          <w:rFonts w:ascii="Times New Roman" w:cs="Times New Roman" w:eastAsia="Times New Roman" w:hAnsi="Times New Roman"/>
-        </w:rPr>
-        <w:t xml:space="preserve">How constructivism challenges the dichotomy</w:t>
-      </w:r>
-    </w:p>
-    <w:p>
-      <w:pPr>
-        <w:jc w:val="both"/>
-      </w:pPr>
-      <w:r>
-        <w:rPr>
-          <w:rFonts w:ascii="Times New Roman" w:cs="Times New Roman" w:eastAsia="Times New Roman" w:hAnsi="Times New Roman"/>
-        </w:rPr>
-        <w:t xml:space="preserve">Constructivism does not simply blend the two approaches; it also challenges them. Against primordialism, it denies that identities are fixed or that conflicts flow inevitably from ancient differences. The idea of "ancient hatreds" is itself treated as a narrative that has to be explained. Against instrumentalism, it rejects the sharp separation between "real" material interests and "mere" identity. For constructivists, interests are themselves shaped by identity: what counts as a group's interest, a threat or a just outcome depends on how the group understands itself. Religion, in this view, is not a mask over underlying interests but part of the lens through which interests are defined. Constructivism also brings in ideas, norms and discourse as causes in their own right, which links naturally with Galtung's (1990) concept of cultural violence.</w:t>
-      </w:r>
-    </w:p>
-    <w:p>
-      <w:pPr>
-        <w:pStyle w:val="Heading3"/>
-      </w:pPr>
-      <w:r>
-        <w:rPr>
-          <w:rFonts w:ascii="Times New Roman" w:cs="Times New Roman" w:eastAsia="Times New Roman" w:hAnsi="Times New Roman"/>
-        </w:rPr>
-        <w:t xml:space="preserve">Limitations of constructivism</w:t>
-      </w:r>
-    </w:p>
-    <w:p>
-      <w:pPr>
-        <w:jc w:val="both"/>
-      </w:pPr>
-      <w:r>
-        <w:rPr>
-          <w:rFonts w:ascii="Times New Roman" w:cs="Times New Roman" w:eastAsia="Times New Roman" w:hAnsi="Times New Roman"/>
-        </w:rPr>
-        <w:t xml:space="preserve">Constructivism has been criticised as well. Because it emphasises fluidity and contingency, it can be better at describing how identities change than at predicting when they will become violent. If identities are always in flux, it can be hard to explain why some are remarkably stable over centuries. Some critics argue that "social construction" is now so widely accepted that it risks becoming a truism unless researchers specify the mechanisms involved (Fearon &amp; Laitin, 2000). Others note that constructivism can underplay the material constraints, such as poverty, land scarcity and state weakness, that instrumentalists highlight.</w:t>
-      </w:r>
-    </w:p>
-    <w:p>
-      <w:pPr>
-        <w:pStyle w:val="Heading3"/>
-      </w:pPr>
-      <w:r>
-        <w:rPr>
-          <w:rFonts w:ascii="Times New Roman" w:cs="Times New Roman" w:eastAsia="Times New Roman" w:hAnsi="Times New Roman"/>
-        </w:rPr>
-        <w:t xml:space="preserve">Conclusion and implications for peacebuilding</w:t>
-      </w:r>
-    </w:p>
-    <w:p>
-      <w:pPr>
-        <w:jc w:val="both"/>
-      </w:pPr>
-      <w:r>
-        <w:rPr>
-          <w:rFonts w:ascii="Times New Roman" w:cs="Times New Roman" w:eastAsia="Times New Roman" w:hAnsi="Times New Roman"/>
-        </w:rPr>
-        <w:t xml:space="preserve">Modern constructivist theories offer the most convincing way out of the primordialist–instrumentalist dichotomy. They accept that religious and cultural identities can be deeply felt, and that they are often manipulated for political ends, but they explain both of these facts as the results of social processes rather than fixed nature or pure calculation. The approach also offers hope for peacebuilding. If identities and enmities are constructed, they can be reconstructed. Inclusive institutions, fair access to resources, responsible leadership, peace education, interfaith cooperation and counter-narratives that stress shared identities can weaken the boundaries that make violence possible. In this sense, constructivism not only bridges the old debate but also points to practical strategies for transforming religiously framed conflicts.</w:t>
+        <w:t xml:space="preserve">Constructivism starts from a simple but powerful idea: much of what we treat as social reality, identity included, is created and kept alive through human interaction, shared meanings and institutions. In international relations, Wendt (1992) put it memorably when he argued that "anarchy is what states make of it". Even the structures that seem most solid rest on shared understandings. When constructivists apply this idea to religion and ethnicity, they conclude that identities are neither inborn givens nor mere tools in the hands of elites. They are social creations, made and remade over time through history, institutions, language and everyday life.</w:t>
+      </w:r>
+    </w:p>
+    <w:p>
+      <w:pPr>
+        <w:pStyle w:val="Heading3"/>
+      </w:pPr>
+      <w:r>
+        <w:rPr>
+          <w:rFonts w:ascii="Times New Roman" w:cs="Times New Roman" w:eastAsia="Times New Roman" w:hAnsi="Times New Roman"/>
+        </w:rPr>
+        <w:t xml:space="preserve">Bridging the two approaches</w:t>
+      </w:r>
+    </w:p>
+    <w:p>
+      <w:pPr>
+        <w:jc w:val="both"/>
+      </w:pPr>
+      <w:r>
+        <w:rPr>
+          <w:rFonts w:ascii="Times New Roman" w:cs="Times New Roman" w:eastAsia="Times New Roman" w:hAnsi="Times New Roman"/>
+        </w:rPr>
+        <w:t xml:space="preserve">Constructivism builds a bridge between the older positions in several ways. To begin with, it agrees with primordialists that identities can feel natural, ancient and deeply meaningful. Benedict Anderson (1983/2006) famously described nations as "imagined communities". He did not mean that they are fake, but that members feel a close bond with millions of people they will never meet. Constructivists explain that feeling as the </w:t>
+      </w:r>
+      <w:r>
+        <w:rPr>
+          <w:rFonts w:ascii="Times New Roman" w:cs="Times New Roman" w:eastAsia="Times New Roman" w:hAnsi="Times New Roman"/>
+          <w:i/>
+          <w:iCs/>
+        </w:rPr>
+        <w:t xml:space="preserve">result</w:t>
+      </w:r>
+      <w:r>
+        <w:rPr>
+          <w:rFonts w:ascii="Times New Roman" w:cs="Times New Roman" w:eastAsia="Times New Roman" w:hAnsi="Times New Roman"/>
+        </w:rPr>
+        <w:t xml:space="preserve"> of social processes, such as schooling, newspapers, religious ritual, colonial classification and state policy, rather than as something biological or prior to society. Identities are constructed, in other words, but once they exist their consequences are entirely real.</w:t>
+      </w:r>
+    </w:p>
+    <w:p>
+      <w:pPr>
+        <w:jc w:val="both"/>
+      </w:pPr>
+      <w:r>
+        <w:rPr>
+          <w:rFonts w:ascii="Times New Roman" w:cs="Times New Roman" w:eastAsia="Times New Roman" w:hAnsi="Times New Roman"/>
+        </w:rPr>
+        <w:t xml:space="preserve">It also agrees with instrumentalists that elites shape identities and use them strategically. But it adds two qualifications. Elites are themselves shaped by the identities and stories their society makes available, and they only succeed when their appeals strike a chord with meanings people already hold. Reviewing the research on the social construction of ethnicity, Fearon and Laitin (2000) find that it points to a mixture of elite strategy, the choices of ordinary people and the long-term effects of discourse. Violence itself can also build identities, hardening boundaries that were once loose and porous.</w:t>
+      </w:r>
+    </w:p>
+    <w:p>
+      <w:pPr>
+        <w:jc w:val="both"/>
+      </w:pPr>
+      <w:r>
+        <w:rPr>
+          <w:rFonts w:ascii="Times New Roman" w:cs="Times New Roman" w:eastAsia="Times New Roman" w:hAnsi="Times New Roman"/>
+        </w:rPr>
+        <w:t xml:space="preserve">Constructivism is also much better at explaining change and variation, which neither older approach handles well. Because identity depends on context, the same person may put their religion first in one setting and their nationality, clan or profession first in another. Brubaker (2004) warns against "groupism", the habit of treating ethnic and religious groups as fixed, clearly bounded actors. He suggests that we should instead study how "groupness" rises and falls as an event: how, at certain moments, people come to see themselves and behave as members of a group. This helps explain why Christian–Muslim relations in a town can be calm for decades and then collapse when political rivalry, rumour and fear suddenly harden the lines between communities.</w:t>
+      </w:r>
+    </w:p>
+    <w:p>
+      <w:pPr>
+        <w:jc w:val="both"/>
+      </w:pPr>
+      <w:r>
+        <w:rPr>
+          <w:rFonts w:ascii="Times New Roman" w:cs="Times New Roman" w:eastAsia="Times New Roman" w:hAnsi="Times New Roman"/>
+        </w:rPr>
+        <w:t xml:space="preserve">African history offers some of the clearest illustrations. Mamdani (2001) shows that the Hutu–Tutsi divide in Rwanda, so often described as an ancient ethnic split, was profoundly reshaped by Belgian colonial rule. The Belgians turned a fluid social and political distinction into a fixed racial category and printed it on identity cards. Post-independence politics built on that classification until it became the basis for genocide. The identities had been constructed, yet people felt them intensely. They were manipulated by elites, yet the manipulation worked only because colonial institutions had made the categories meaningful. Rwanda shows how constructivism can hold the insights of both primordialism and instrumentalism together in a single explanation.</w:t>
+      </w:r>
+    </w:p>
+    <w:p>
+      <w:pPr>
+        <w:pStyle w:val="Heading3"/>
+      </w:pPr>
+      <w:r>
+        <w:rPr>
+          <w:rFonts w:ascii="Times New Roman" w:cs="Times New Roman" w:eastAsia="Times New Roman" w:hAnsi="Times New Roman"/>
+        </w:rPr>
+        <w:t xml:space="preserve">Challenging the two approaches</w:t>
+      </w:r>
+    </w:p>
+    <w:p>
+      <w:pPr>
+        <w:jc w:val="both"/>
+      </w:pPr>
+      <w:r>
+        <w:rPr>
+          <w:rFonts w:ascii="Times New Roman" w:cs="Times New Roman" w:eastAsia="Times New Roman" w:hAnsi="Times New Roman"/>
+        </w:rPr>
+        <w:t xml:space="preserve">Constructivism does more than blend the two older views; it challenges both of them. Against primordialism, it denies that identities are fixed or that conflict flows naturally from ancient differences. The "ancient hatreds" story is treated as something to be explained, not as an explanation. Against instrumentalism, it rejects the neat division between "real" material interests and "mere" identity. Constructivists argue that interests are themselves shaped by identity. What a group regards as its interest, as a threat or as a fair outcome depends on how it understands who it is. Religion, from this angle, is not a mask over hidden interests but part of the lens through which interests are seen in the first place. This emphasis on ideas, norms and discourse as causes in their own right also fits neatly with Galtung's (1990) concept of cultural violence.</w:t>
+      </w:r>
+    </w:p>
+    <w:p>
+      <w:pPr>
+        <w:pStyle w:val="Heading3"/>
+      </w:pPr>
+      <w:r>
+        <w:rPr>
+          <w:rFonts w:ascii="Times New Roman" w:cs="Times New Roman" w:eastAsia="Times New Roman" w:hAnsi="Times New Roman"/>
+        </w:rPr>
+        <w:t xml:space="preserve">Limitations</w:t>
+      </w:r>
+    </w:p>
+    <w:p>
+      <w:pPr>
+        <w:jc w:val="both"/>
+      </w:pPr>
+      <w:r>
+        <w:rPr>
+          <w:rFonts w:ascii="Times New Roman" w:cs="Times New Roman" w:eastAsia="Times New Roman" w:hAnsi="Times New Roman"/>
+        </w:rPr>
+        <w:t xml:space="preserve">Constructivism has its critics as well. Because it stresses fluidity and contingency, it is often better at describing how identities change than at predicting when they will turn violent. If identities are always shifting, why are some of them so remarkably stable over centuries? Some scholars also worry that "social construction" is now so widely accepted that it is in danger of becoming a cliché, unless researchers spell out the specific mechanisms at work (Fearon &amp; Laitin, 2000). Others feel that constructivism can lose sight of the material pressures, such as poverty, scarce land and weak states, that instrumentalists rightly emphasise.</w:t>
+      </w:r>
+    </w:p>
+    <w:p>
+      <w:pPr>
+        <w:pStyle w:val="Heading3"/>
+      </w:pPr>
+      <w:r>
+        <w:rPr>
+          <w:rFonts w:ascii="Times New Roman" w:cs="Times New Roman" w:eastAsia="Times New Roman" w:hAnsi="Times New Roman"/>
+        </w:rPr>
+        <w:t xml:space="preserve">Conclusion</w:t>
+      </w:r>
+    </w:p>
+    <w:p>
+      <w:pPr>
+        <w:jc w:val="both"/>
+      </w:pPr>
+      <w:r>
+        <w:rPr>
+          <w:rFonts w:ascii="Times New Roman" w:cs="Times New Roman" w:eastAsia="Times New Roman" w:hAnsi="Times New Roman"/>
+        </w:rPr>
+        <w:t xml:space="preserve">In my view, constructivism offers the most convincing way out of the primordialist–instrumentalist deadlock. It accepts that religious and cultural identities can be deeply felt, and that they are often manipulated for political gain, but it explains both facts as the outcome of social processes rather than of fixed human nature or cold calculation. It also offers some grounds for hope. If identities and enmities are constructed, they can be reconstructed. Fair institutions, equitable access to resources, responsible leadership, peace education, cooperation across faiths and stories that stress what people share can all weaken the boundaries that make violence possible. In this sense constructivism not only moves the old debate forward but also points to practical ways of transforming religiously framed conflicts.</w:t>
       </w:r>
     </w:p>
     <w:p>

</xml_diff>